<commit_message>
Add graphs to word file and TensorBoard instructions to README
</commit_message>
<xml_diff>
--- a/EX1/Deep_Learning_Ex1_Theoretical_Part.docx
+++ b/EX1/Deep_Learning_Ex1_Theoretical_Part.docx
@@ -1248,36 +1248,23 @@
         <w:pStyle w:val="Heading2"/>
       </w:pPr>
       <w:r>
-        <w:lastRenderedPageBreak/>
-        <w:t>Question 3 — Batch Normalization (1</w:t>
-      </w:r>
-      <w:proofErr w:type="gramStart"/>
-      <w:r>
-        <w:t>D) —</w:t>
-      </w:r>
-      <w:proofErr w:type="gramEnd"/>
-      <w:r>
-        <w:t xml:space="preserve"> backward derivatives</w:t>
-      </w:r>
-    </w:p>
-    <w:p>
-      <w:r>
         <w:rPr>
           <w:noProof/>
         </w:rPr>
+        <w:lastRenderedPageBreak/>
         <w:drawing>
-          <wp:anchor distT="0" distB="0" distL="114300" distR="114300" simplePos="0" relativeHeight="251657728" behindDoc="0" locked="0" layoutInCell="1" allowOverlap="1" wp14:anchorId="7CBFE737" wp14:editId="61919CC6">
+          <wp:anchor distT="0" distB="0" distL="114300" distR="114300" simplePos="0" relativeHeight="251736576" behindDoc="0" locked="0" layoutInCell="1" allowOverlap="1" wp14:anchorId="19C2E9B4" wp14:editId="4C8F3885">
             <wp:simplePos x="0" y="0"/>
             <wp:positionH relativeFrom="column">
               <wp:posOffset>0</wp:posOffset>
             </wp:positionH>
             <wp:positionV relativeFrom="paragraph">
-              <wp:posOffset>59690</wp:posOffset>
+              <wp:posOffset>317500</wp:posOffset>
             </wp:positionV>
-            <wp:extent cx="4678680" cy="8214360"/>
-            <wp:effectExtent l="0" t="0" r="7620" b="0"/>
+            <wp:extent cx="5626100" cy="8223250"/>
+            <wp:effectExtent l="0" t="0" r="0" b="6350"/>
             <wp:wrapSquare wrapText="bothSides"/>
-            <wp:docPr id="446886209" name="Picture 1"/>
+            <wp:docPr id="1095370391" name="Picture 13"/>
             <wp:cNvGraphicFramePr>
               <a:graphicFrameLocks xmlns:a="http://schemas.openxmlformats.org/drawingml/2006/main" noChangeAspect="1"/>
             </wp:cNvGraphicFramePr>
@@ -1285,20 +1272,20 @@
               <a:graphicData uri="http://schemas.openxmlformats.org/drawingml/2006/picture">
                 <pic:pic xmlns:pic="http://schemas.openxmlformats.org/drawingml/2006/picture">
                   <pic:nvPicPr>
-                    <pic:cNvPr id="0" name="Picture 1"/>
+                    <pic:cNvPr id="0" name="Picture 13"/>
                     <pic:cNvPicPr>
                       <a:picLocks noChangeAspect="1" noChangeArrowheads="1"/>
                     </pic:cNvPicPr>
                   </pic:nvPicPr>
-                  <pic:blipFill rotWithShape="1">
-                    <a:blip r:embed="rId6">
+                  <pic:blipFill>
+                    <a:blip r:embed="rId8">
                       <a:extLst>
                         <a:ext uri="{28A0092B-C50C-407E-A947-70E740481C1C}">
                           <a14:useLocalDpi xmlns:a14="http://schemas.microsoft.com/office/drawing/2010/main" val="0"/>
                         </a:ext>
                       </a:extLst>
                     </a:blip>
-                    <a:srcRect r="14603"/>
+                    <a:srcRect/>
                     <a:stretch>
                       <a:fillRect/>
                     </a:stretch>
@@ -1306,7 +1293,74 @@
                   <pic:spPr bwMode="auto">
                     <a:xfrm>
                       <a:off x="0" y="0"/>
-                      <a:ext cx="4678680" cy="8214360"/>
+                      <a:ext cx="5626100" cy="8223250"/>
+                    </a:xfrm>
+                    <a:prstGeom prst="rect">
+                      <a:avLst/>
+                    </a:prstGeom>
+                    <a:noFill/>
+                    <a:ln>
+                      <a:noFill/>
+                    </a:ln>
+                  </pic:spPr>
+                </pic:pic>
+              </a:graphicData>
+            </a:graphic>
+          </wp:anchor>
+        </w:drawing>
+      </w:r>
+      <w:r>
+        <w:t>Question 3 — Batch Normalization (1</w:t>
+      </w:r>
+      <w:proofErr w:type="gramStart"/>
+      <w:r>
+        <w:t>D) —</w:t>
+      </w:r>
+      <w:proofErr w:type="gramEnd"/>
+      <w:r>
+        <w:t xml:space="preserve"> backward derivatives</w:t>
+      </w:r>
+    </w:p>
+    <w:p>
+      <w:r>
+        <w:rPr>
+          <w:noProof/>
+        </w:rPr>
+        <w:lastRenderedPageBreak/>
+        <w:drawing>
+          <wp:inline distT="0" distB="0" distL="0" distR="0" wp14:anchorId="2C120AA3" wp14:editId="57691E8F">
+            <wp:extent cx="5632450" cy="4921250"/>
+            <wp:effectExtent l="0" t="0" r="6350" b="0"/>
+            <wp:docPr id="1903676497" name="Picture 14"/>
+            <wp:cNvGraphicFramePr>
+              <a:graphicFrameLocks xmlns:a="http://schemas.openxmlformats.org/drawingml/2006/main" noChangeAspect="1"/>
+            </wp:cNvGraphicFramePr>
+            <a:graphic xmlns:a="http://schemas.openxmlformats.org/drawingml/2006/main">
+              <a:graphicData uri="http://schemas.openxmlformats.org/drawingml/2006/picture">
+                <pic:pic xmlns:pic="http://schemas.openxmlformats.org/drawingml/2006/picture">
+                  <pic:nvPicPr>
+                    <pic:cNvPr id="0" name="Picture 14"/>
+                    <pic:cNvPicPr>
+                      <a:picLocks noChangeAspect="1" noChangeArrowheads="1"/>
+                    </pic:cNvPicPr>
+                  </pic:nvPicPr>
+                  <pic:blipFill rotWithShape="1">
+                    <a:blip r:embed="rId9">
+                      <a:extLst>
+                        <a:ext uri="{28A0092B-C50C-407E-A947-70E740481C1C}">
+                          <a14:useLocalDpi xmlns:a14="http://schemas.microsoft.com/office/drawing/2010/main" val="0"/>
+                        </a:ext>
+                      </a:extLst>
+                    </a:blip>
+                    <a:srcRect b="40613"/>
+                    <a:stretch>
+                      <a:fillRect/>
+                    </a:stretch>
+                  </pic:blipFill>
+                  <pic:spPr bwMode="auto">
+                    <a:xfrm>
+                      <a:off x="0" y="0"/>
+                      <a:ext cx="5632450" cy="4921250"/>
                     </a:xfrm>
                     <a:prstGeom prst="rect">
                       <a:avLst/>
@@ -1324,10 +1378,7 @@
                 </pic:pic>
               </a:graphicData>
             </a:graphic>
-            <wp14:sizeRelH relativeFrom="margin">
-              <wp14:pctWidth>0</wp14:pctWidth>
-            </wp14:sizeRelH>
-          </wp:anchor>
+          </wp:inline>
         </w:drawing>
       </w:r>
     </w:p>
@@ -1335,44 +1386,1194 @@
     <w:p/>
     <w:p/>
     <w:p/>
-    <w:p/>
-    <w:p/>
-    <w:p/>
-    <w:p/>
-    <w:p/>
-    <w:p/>
-    <w:p/>
-    <w:p/>
-    <w:p/>
-    <w:p/>
-    <w:p/>
-    <w:p/>
-    <w:p/>
-    <w:p/>
-    <w:p/>
-    <w:p/>
-    <w:p/>
-    <w:p/>
+    <w:p>
+      <w:pPr>
+        <w:pStyle w:val="Heading1"/>
+      </w:pPr>
+    </w:p>
+    <w:p>
+      <w:pPr>
+        <w:pStyle w:val="Heading1"/>
+      </w:pPr>
+    </w:p>
     <w:p/>
     <w:p>
+      <w:pPr>
+        <w:pStyle w:val="Heading1"/>
+      </w:pPr>
+      <w:r>
+        <w:lastRenderedPageBreak/>
+        <w:t>Practical Part</w:t>
+      </w:r>
+    </w:p>
+    <w:p>
+      <w:r>
+        <w:t>In this part we examine the</w:t>
+      </w:r>
+      <w:r>
+        <w:t xml:space="preserve"> performance of the LeNet-5 </w:t>
+      </w:r>
+      <w:r>
+        <w:t>architecture</w:t>
+      </w:r>
+      <w:r>
+        <w:t xml:space="preserve"> on the Fashion-MNIST datase</w:t>
+      </w:r>
+      <w:r>
+        <w:t>t, evaluating the following regularization techniques:</w:t>
+      </w:r>
+    </w:p>
+    <w:p>
+      <w:pPr>
+        <w:pStyle w:val="ListParagraph"/>
+        <w:numPr>
+          <w:ilvl w:val="0"/>
+          <w:numId w:val="24"/>
+        </w:numPr>
+      </w:pPr>
       <w:r>
         <w:rPr>
+          <w:b/>
+          <w:bCs/>
+        </w:rPr>
+        <w:t>Baseline LeNet-5</w:t>
+      </w:r>
+      <w:r>
+        <w:t xml:space="preserve"> - </w:t>
+      </w:r>
+      <w:r>
+        <w:t>unmodified LeNet-5 architecture without any regularization components.</w:t>
+      </w:r>
+    </w:p>
+    <w:p>
+      <w:pPr>
+        <w:pStyle w:val="ListParagraph"/>
+        <w:numPr>
+          <w:ilvl w:val="0"/>
+          <w:numId w:val="24"/>
+        </w:numPr>
+      </w:pPr>
+      <w:r>
+        <w:rPr>
+          <w:b/>
+          <w:bCs/>
+        </w:rPr>
+        <w:t>Dropout</w:t>
+      </w:r>
+      <w:r>
+        <w:t xml:space="preserve"> - </w:t>
+      </w:r>
+      <w:r>
+        <w:t xml:space="preserve">dropout layer (p=0.5) is added after the first </w:t>
+      </w:r>
+      <w:proofErr w:type="gramStart"/>
+      <w:r>
+        <w:t>fully-connected</w:t>
+      </w:r>
+      <w:proofErr w:type="gramEnd"/>
+      <w:r>
+        <w:t xml:space="preserve"> layer.</w:t>
+      </w:r>
+      <w:r>
+        <w:t xml:space="preserve"> </w:t>
+      </w:r>
+      <w:r>
+        <w:t xml:space="preserve">During training, </w:t>
+      </w:r>
+      <w:proofErr w:type="gramStart"/>
+      <w:r>
+        <w:t>dropout randomly deactivates</w:t>
+      </w:r>
+      <w:proofErr w:type="gramEnd"/>
+      <w:r>
+        <w:t xml:space="preserve"> </w:t>
+      </w:r>
+      <w:proofErr w:type="gramStart"/>
+      <w:r>
+        <w:t>activations</w:t>
+      </w:r>
+      <w:r>
+        <w:t>.</w:t>
+      </w:r>
+      <w:r>
+        <w:t>.</w:t>
+      </w:r>
+      <w:proofErr w:type="gramEnd"/>
+      <w:r>
+        <w:t xml:space="preserve"> </w:t>
+      </w:r>
+      <w:r>
+        <w:t>When evaluating accuracy, dropout is automatically disabled</w:t>
+      </w:r>
+    </w:p>
+    <w:p>
+      <w:pPr>
+        <w:pStyle w:val="ListParagraph"/>
+        <w:numPr>
+          <w:ilvl w:val="0"/>
+          <w:numId w:val="24"/>
+        </w:numPr>
+      </w:pPr>
+      <w:r>
+        <w:rPr>
+          <w:b/>
+          <w:bCs/>
+        </w:rPr>
+        <w:t>Batch Normalization</w:t>
+      </w:r>
+      <w:r>
+        <w:t xml:space="preserve"> -</w:t>
+      </w:r>
+      <w:r>
+        <w:t xml:space="preserve"> applied after both convolution layers.</w:t>
+      </w:r>
+    </w:p>
+    <w:p>
+      <w:pPr>
+        <w:pStyle w:val="ListParagraph"/>
+        <w:numPr>
+          <w:ilvl w:val="0"/>
+          <w:numId w:val="24"/>
+        </w:numPr>
+        <w:rPr>
+          <w:b/>
+          <w:bCs/>
+        </w:rPr>
+      </w:pPr>
+      <w:r>
+        <w:rPr>
+          <w:b/>
+          <w:bCs/>
+        </w:rPr>
+        <w:t>Weight Decay</w:t>
+      </w:r>
+      <w:r>
+        <w:rPr>
+          <w:b/>
+          <w:bCs/>
+        </w:rPr>
+        <w:t xml:space="preserve"> </w:t>
+      </w:r>
+      <w:r>
+        <w:t xml:space="preserve">- </w:t>
+      </w:r>
+      <w:r>
+        <w:t>(L2 regularization) penalizes model weights by adding a norm-based penalty to the loss function.</w:t>
+      </w:r>
+    </w:p>
+    <w:p>
+      <w:r>
+        <w:t xml:space="preserve">The implemented network </w:t>
+      </w:r>
+      <w:r>
+        <w:t>uses the classical</w:t>
+      </w:r>
+      <w:r>
+        <w:t xml:space="preserve"> LeNet-5</w:t>
+      </w:r>
+      <w:r>
+        <w:rPr>
+          <w:rStyle w:val="FootnoteReference"/>
+        </w:rPr>
+        <w:footnoteReference w:id="1"/>
+      </w:r>
+      <w:r>
+        <w:t xml:space="preserve"> structure</w:t>
+      </w:r>
+      <w:r>
+        <w:t>, with a version</w:t>
+      </w:r>
+      <w:r>
+        <w:t xml:space="preserve"> tailored for 28×28 grayscale Fashion-MNIST</w:t>
+      </w:r>
+      <w:r>
+        <w:t>.</w:t>
+      </w:r>
+      <w:r>
+        <w:t xml:space="preserve"> The input images are processed </w:t>
+      </w:r>
+      <w:r>
+        <w:t>through the following stages:</w:t>
+      </w:r>
+    </w:p>
+    <w:p>
+      <w:pPr>
+        <w:spacing w:line="240" w:lineRule="auto"/>
+      </w:pPr>
+      <w:r>
+        <w:rPr>
+          <w:b/>
+          <w:bCs/>
+        </w:rPr>
+        <w:t>Input:</w:t>
+      </w:r>
+      <w:r>
+        <w:br/>
+        <w:t>1×28×28 grayscale image</w:t>
+      </w:r>
+    </w:p>
+    <w:p>
+      <w:pPr>
+        <w:spacing w:line="240" w:lineRule="auto"/>
+      </w:pPr>
+      <w:r>
+        <w:rPr>
+          <w:b/>
+          <w:bCs/>
+        </w:rPr>
+        <w:t>Feature Extraction:</w:t>
+      </w:r>
+    </w:p>
+    <w:p>
+      <w:pPr>
+        <w:pStyle w:val="ListParagraph"/>
+        <w:numPr>
+          <w:ilvl w:val="0"/>
+          <w:numId w:val="24"/>
+        </w:numPr>
+      </w:pPr>
+      <w:r>
+        <w:t xml:space="preserve">Conv1: </w:t>
+      </w:r>
+    </w:p>
+    <w:p>
+      <w:pPr>
+        <w:pStyle w:val="ListParagraph"/>
+        <w:numPr>
+          <w:ilvl w:val="1"/>
+          <w:numId w:val="24"/>
+        </w:numPr>
+      </w:pPr>
+      <w:r>
+        <w:t>1 → 6, 5×5 kernel, stride 1, padding 2</w:t>
+      </w:r>
+      <w:r>
+        <w:t>. Output shape: 6x28x28.</w:t>
+      </w:r>
+    </w:p>
+    <w:p>
+      <w:pPr>
+        <w:pStyle w:val="ListParagraph"/>
+        <w:numPr>
+          <w:ilvl w:val="1"/>
+          <w:numId w:val="24"/>
+        </w:numPr>
+      </w:pPr>
+      <w:r>
+        <w:t>O</w:t>
+      </w:r>
+      <w:r>
+        <w:t xml:space="preserve">ptional </w:t>
+      </w:r>
+      <w:proofErr w:type="spellStart"/>
+      <w:r>
+        <w:t>BatchNorm</w:t>
+      </w:r>
+      <w:proofErr w:type="spellEnd"/>
+      <w:r>
+        <w:t xml:space="preserve"> after Conv1 in the </w:t>
+      </w:r>
+      <w:proofErr w:type="spellStart"/>
+      <w:r>
+        <w:t>BatchNorm</w:t>
+      </w:r>
+      <w:proofErr w:type="spellEnd"/>
+      <w:r>
+        <w:t xml:space="preserve"> configuration</w:t>
+      </w:r>
+      <w:r>
+        <w:t>.</w:t>
+      </w:r>
+    </w:p>
+    <w:p>
+      <w:pPr>
+        <w:pStyle w:val="ListParagraph"/>
+        <w:numPr>
+          <w:ilvl w:val="1"/>
+          <w:numId w:val="24"/>
+        </w:numPr>
+      </w:pPr>
+      <w:proofErr w:type="spellStart"/>
+      <w:r>
+        <w:t>ReLU</w:t>
+      </w:r>
+      <w:proofErr w:type="spellEnd"/>
+      <w:r>
+        <w:t xml:space="preserve"> activation.</w:t>
+      </w:r>
+    </w:p>
+    <w:p>
+      <w:pPr>
+        <w:pStyle w:val="ListParagraph"/>
+        <w:numPr>
+          <w:ilvl w:val="1"/>
+          <w:numId w:val="24"/>
+        </w:numPr>
+      </w:pPr>
+      <w:r>
+        <w:t xml:space="preserve">2x2 </w:t>
+      </w:r>
+      <w:r>
+        <w:t>Av</w:t>
+      </w:r>
+      <w:r>
+        <w:t>era</w:t>
+      </w:r>
+      <w:r>
+        <w:t>g</w:t>
+      </w:r>
+      <w:r>
+        <w:t>e p</w:t>
+      </w:r>
+      <w:r>
+        <w:t>ool</w:t>
+      </w:r>
+      <w:r>
+        <w:t>ing. Output shape: 6x14x14.</w:t>
+      </w:r>
+    </w:p>
+    <w:p>
+      <w:pPr>
+        <w:pStyle w:val="ListParagraph"/>
+        <w:numPr>
+          <w:ilvl w:val="0"/>
+          <w:numId w:val="24"/>
+        </w:numPr>
+      </w:pPr>
+      <w:r>
+        <w:t xml:space="preserve">Conv2: </w:t>
+      </w:r>
+    </w:p>
+    <w:p>
+      <w:pPr>
+        <w:pStyle w:val="ListParagraph"/>
+        <w:numPr>
+          <w:ilvl w:val="1"/>
+          <w:numId w:val="24"/>
+        </w:numPr>
+      </w:pPr>
+      <w:r>
+        <w:t>6 → 16, 5×5 kernel, stride 1</w:t>
+      </w:r>
+      <w:r>
+        <w:t>. Output shape 16x10x10.</w:t>
+      </w:r>
+    </w:p>
+    <w:p>
+      <w:pPr>
+        <w:pStyle w:val="ListParagraph"/>
+        <w:numPr>
+          <w:ilvl w:val="1"/>
+          <w:numId w:val="24"/>
+        </w:numPr>
+      </w:pPr>
+      <w:r>
+        <w:t>O</w:t>
+      </w:r>
+      <w:r>
+        <w:t xml:space="preserve">ptional </w:t>
+      </w:r>
+      <w:proofErr w:type="spellStart"/>
+      <w:r>
+        <w:t>BatchNorm</w:t>
+      </w:r>
+      <w:proofErr w:type="spellEnd"/>
+      <w:r>
+        <w:t xml:space="preserve"> after Conv2 in the </w:t>
+      </w:r>
+      <w:proofErr w:type="spellStart"/>
+      <w:r>
+        <w:t>BatchNorm</w:t>
+      </w:r>
+      <w:proofErr w:type="spellEnd"/>
+      <w:r>
+        <w:t xml:space="preserve"> configuration</w:t>
+      </w:r>
+      <w:r>
+        <w:t>.</w:t>
+      </w:r>
+    </w:p>
+    <w:p>
+      <w:pPr>
+        <w:pStyle w:val="ListParagraph"/>
+        <w:numPr>
+          <w:ilvl w:val="1"/>
+          <w:numId w:val="24"/>
+        </w:numPr>
+      </w:pPr>
+      <w:proofErr w:type="spellStart"/>
+      <w:r>
+        <w:t>ReLU</w:t>
+      </w:r>
+      <w:proofErr w:type="spellEnd"/>
+      <w:r>
+        <w:t xml:space="preserve"> activation.</w:t>
+      </w:r>
+    </w:p>
+    <w:p>
+      <w:pPr>
+        <w:pStyle w:val="ListParagraph"/>
+        <w:numPr>
+          <w:ilvl w:val="1"/>
+          <w:numId w:val="24"/>
+        </w:numPr>
+      </w:pPr>
+      <w:r>
+        <w:t xml:space="preserve">2x2 </w:t>
+      </w:r>
+      <w:r>
+        <w:t>Av</w:t>
+      </w:r>
+      <w:r>
+        <w:t>era</w:t>
+      </w:r>
+      <w:r>
+        <w:t>g</w:t>
+      </w:r>
+      <w:r>
+        <w:t>e p</w:t>
+      </w:r>
+      <w:r>
+        <w:t>ool</w:t>
+      </w:r>
+      <w:r>
+        <w:t>ing. Output shape 16x5x5.</w:t>
+      </w:r>
+    </w:p>
+    <w:p>
+      <w:pPr>
+        <w:spacing w:line="240" w:lineRule="auto"/>
+      </w:pPr>
+      <w:r>
+        <w:t>After the second pooling operation, the spatial dimension reaches 5×5, yielding a flattened feature vector of length 400.</w:t>
+      </w:r>
+    </w:p>
+    <w:p>
+      <w:pPr>
+        <w:spacing w:line="240" w:lineRule="auto"/>
+      </w:pPr>
+      <w:r>
+        <w:rPr>
+          <w:b/>
+          <w:bCs/>
+        </w:rPr>
+        <w:t>Classification Head:</w:t>
+      </w:r>
+    </w:p>
+    <w:p>
+      <w:pPr>
+        <w:pStyle w:val="ListParagraph"/>
+        <w:numPr>
+          <w:ilvl w:val="0"/>
+          <w:numId w:val="24"/>
+        </w:numPr>
+      </w:pPr>
+      <w:r>
+        <w:t>Fully connected: 400 → 120</w:t>
+      </w:r>
+    </w:p>
+    <w:p>
+      <w:pPr>
+        <w:pStyle w:val="ListParagraph"/>
+        <w:numPr>
+          <w:ilvl w:val="0"/>
+          <w:numId w:val="24"/>
+        </w:numPr>
+      </w:pPr>
+      <w:r>
+        <w:t>Fully connected: 120 → 84</w:t>
+      </w:r>
+    </w:p>
+    <w:p>
+      <w:pPr>
+        <w:pStyle w:val="ListParagraph"/>
+        <w:numPr>
+          <w:ilvl w:val="0"/>
+          <w:numId w:val="24"/>
+        </w:numPr>
+      </w:pPr>
+      <w:r>
+        <w:t>Fully connected: 84 → 10</w:t>
+      </w:r>
+      <w:r>
+        <w:t>.</w:t>
+      </w:r>
+    </w:p>
+    <w:p>
+      <w:r>
+        <w:t xml:space="preserve">The convolutional and </w:t>
+      </w:r>
+      <w:proofErr w:type="gramStart"/>
+      <w:r>
+        <w:t>fully-connected</w:t>
+      </w:r>
+      <w:proofErr w:type="gramEnd"/>
+      <w:r>
+        <w:t xml:space="preserve"> layer dimensions follow the canonical architecture, while </w:t>
+      </w:r>
+      <w:proofErr w:type="spellStart"/>
+      <w:r>
+        <w:t>ReLU</w:t>
+      </w:r>
+      <w:proofErr w:type="spellEnd"/>
+      <w:r>
+        <w:t xml:space="preserve"> activations are used instead of tanh, which is standard practice today, and averaging pooling replaces subsampling.</w:t>
+      </w:r>
+      <w:r>
+        <w:t xml:space="preserve"> </w:t>
+      </w:r>
+      <w:r>
+        <w:t>Batch normalization and dropout are parameterized as optional model components. Weight decay is supplied through the optimizer.</w:t>
+      </w:r>
+      <w:r>
+        <w:t xml:space="preserve"> </w:t>
+      </w:r>
+    </w:p>
+    <w:p>
+      <w:r>
+        <w:lastRenderedPageBreak/>
+        <w:t>A supplementary script was developed to simplify model loading and evaluation. This script</w:t>
+      </w:r>
+      <w:r>
+        <w:t xml:space="preserve"> r</w:t>
+      </w:r>
+      <w:r>
+        <w:t>ebuilds a LeNet-5 instance in the corresponding configuration</w:t>
+      </w:r>
+      <w:r>
+        <w:t>, l</w:t>
+      </w:r>
+      <w:r>
+        <w:t xml:space="preserve">oads its .pt weight file from the </w:t>
+      </w:r>
+      <w:r>
+        <w:t>“</w:t>
+      </w:r>
+      <w:r>
+        <w:t>checkpoints</w:t>
+      </w:r>
+      <w:r>
+        <w:t>”</w:t>
+      </w:r>
+      <w:r>
+        <w:t xml:space="preserve"> folder</w:t>
+      </w:r>
+      <w:r>
+        <w:t>, e</w:t>
+      </w:r>
+      <w:r>
+        <w:t>valuates it on the full test set</w:t>
+      </w:r>
+      <w:r>
+        <w:t>, and p</w:t>
+      </w:r>
+      <w:r>
+        <w:t>rints its final test accuracy</w:t>
+      </w:r>
+      <w:r>
+        <w:t>.</w:t>
+      </w:r>
+      <w:r>
+        <w:t xml:space="preserve"> </w:t>
+      </w:r>
+      <w:r>
+        <w:t>This enables immediate validation of trained models without re-training.</w:t>
+      </w:r>
+      <w:r>
+        <w:t xml:space="preserve"> </w:t>
+      </w:r>
+      <w:r>
+        <w:t>All models in this project are trained using the Adam optimizer</w:t>
+      </w:r>
+      <w:r>
+        <w:t xml:space="preserve">.  </w:t>
+      </w:r>
+      <w:r>
+        <w:t>In this implementation Adam is used with the following settings:</w:t>
+      </w:r>
+    </w:p>
+    <w:p>
+      <w:pPr>
+        <w:pStyle w:val="ListParagraph"/>
+        <w:numPr>
+          <w:ilvl w:val="0"/>
+          <w:numId w:val="25"/>
+        </w:numPr>
+      </w:pPr>
+      <w:r>
+        <w:t>learning rate: 1×10⁻³</w:t>
+      </w:r>
+    </w:p>
+    <w:p>
+      <w:pPr>
+        <w:pStyle w:val="ListParagraph"/>
+        <w:numPr>
+          <w:ilvl w:val="0"/>
+          <w:numId w:val="25"/>
+        </w:numPr>
+      </w:pPr>
+      <w:r>
+        <w:t>β₁: default (0.9)</w:t>
+      </w:r>
+    </w:p>
+    <w:p>
+      <w:pPr>
+        <w:pStyle w:val="ListParagraph"/>
+        <w:numPr>
+          <w:ilvl w:val="0"/>
+          <w:numId w:val="25"/>
+        </w:numPr>
+      </w:pPr>
+      <w:r>
+        <w:t>β₂: default (0.999)</w:t>
+      </w:r>
+    </w:p>
+    <w:p>
+      <w:pPr>
+        <w:pStyle w:val="ListParagraph"/>
+        <w:numPr>
+          <w:ilvl w:val="0"/>
+          <w:numId w:val="25"/>
+        </w:numPr>
+      </w:pPr>
+      <w:r>
+        <w:t>ε: default (1e-8)</w:t>
+      </w:r>
+    </w:p>
+    <w:p>
+      <w:r>
+        <w:t xml:space="preserve">In the </w:t>
+      </w:r>
+      <w:r>
+        <w:t>Weight Decay</w:t>
+      </w:r>
+      <w:r>
+        <w:t xml:space="preserve"> configuration, the Adam optimizer is additionally supplied with </w:t>
+      </w:r>
+      <w:r>
+        <w:t>weight decay</w:t>
+      </w:r>
+      <w:r>
+        <w:t xml:space="preserve"> = 5×10⁻⁴</w:t>
+      </w:r>
+      <w:r>
+        <w:t xml:space="preserve">. </w:t>
+      </w:r>
+      <w:r>
+        <w:t>Importantly, the optimizer, learning rate, batch size, and training schedule are kept identical across all four configurations to ensure a fair comparison. No learning-rate scheduling or early stopping is applied, to preserve clear comparability across different regularization strategies.</w:t>
+      </w:r>
+    </w:p>
+    <w:p>
+      <w:pPr>
+        <w:rPr>
+          <w:b/>
+          <w:bCs/>
+        </w:rPr>
+      </w:pPr>
+      <w:r>
+        <w:rPr>
+          <w:b/>
+          <w:bCs/>
+        </w:rPr>
+        <w:t>Results</w:t>
+      </w:r>
+    </w:p>
+    <w:p>
+      <w:r>
+        <w:t xml:space="preserve">Results are summarized in </w:t>
+      </w:r>
+      <w:proofErr w:type="gramStart"/>
+      <w:r>
+        <w:t xml:space="preserve">the </w:t>
+      </w:r>
+      <w:r>
+        <w:t>Table</w:t>
+      </w:r>
+      <w:proofErr w:type="gramEnd"/>
+      <w:r>
+        <w:t xml:space="preserve"> 1 below:</w:t>
+      </w:r>
+      <w:r>
+        <w:t xml:space="preserve"> (also exported as a csv file from the main scripts):</w:t>
+      </w:r>
+    </w:p>
+    <w:tbl>
+      <w:tblPr>
+        <w:tblStyle w:val="PlainTable1"/>
+        <w:tblW w:w="5510" w:type="dxa"/>
+        <w:jc w:val="center"/>
+        <w:tblLook w:val="04A0" w:firstRow="1" w:lastRow="0" w:firstColumn="1" w:lastColumn="0" w:noHBand="0" w:noVBand="1"/>
+      </w:tblPr>
+      <w:tblGrid>
+        <w:gridCol w:w="1423"/>
+        <w:gridCol w:w="2200"/>
+        <w:gridCol w:w="2120"/>
+      </w:tblGrid>
+      <w:tr>
+        <w:trPr>
+          <w:cnfStyle w:val="100000000000" w:firstRow="1" w:lastRow="0" w:firstColumn="0" w:lastColumn="0" w:oddVBand="0" w:evenVBand="0" w:oddHBand="0" w:evenHBand="0" w:firstRowFirstColumn="0" w:firstRowLastColumn="0" w:lastRowFirstColumn="0" w:lastRowLastColumn="0"/>
+          <w:trHeight w:val="288"/>
+          <w:jc w:val="center"/>
+        </w:trPr>
+        <w:tc>
+          <w:tcPr>
+            <w:cnfStyle w:val="001000000000" w:firstRow="0" w:lastRow="0" w:firstColumn="1" w:lastColumn="0" w:oddVBand="0" w:evenVBand="0" w:oddHBand="0" w:evenHBand="0" w:firstRowFirstColumn="0" w:firstRowLastColumn="0" w:lastRowFirstColumn="0" w:lastRowLastColumn="0"/>
+            <w:tcW w:w="1190" w:type="dxa"/>
+            <w:noWrap/>
+            <w:hideMark/>
+          </w:tcPr>
+          <w:p>
+            <w:pPr>
+              <w:rPr>
+                <w:rFonts w:ascii="Aptos Narrow" w:eastAsia="Times New Roman" w:hAnsi="Aptos Narrow" w:cs="Times New Roman"/>
+                <w:color w:val="000000"/>
+                <w:lang w:bidi="he-IL"/>
+              </w:rPr>
+            </w:pPr>
+            <w:r>
+              <w:rPr>
+                <w:rFonts w:ascii="Aptos Narrow" w:eastAsia="Times New Roman" w:hAnsi="Aptos Narrow" w:cs="Times New Roman"/>
+                <w:color w:val="000000"/>
+                <w:lang w:bidi="he-IL"/>
+              </w:rPr>
+              <w:t>Model</w:t>
+            </w:r>
+          </w:p>
+        </w:tc>
+        <w:tc>
+          <w:tcPr>
+            <w:tcW w:w="2200" w:type="dxa"/>
+            <w:noWrap/>
+            <w:hideMark/>
+          </w:tcPr>
+          <w:p>
+            <w:pPr>
+              <w:cnfStyle w:val="100000000000" w:firstRow="1" w:lastRow="0" w:firstColumn="0" w:lastColumn="0" w:oddVBand="0" w:evenVBand="0" w:oddHBand="0" w:evenHBand="0" w:firstRowFirstColumn="0" w:firstRowLastColumn="0" w:lastRowFirstColumn="0" w:lastRowLastColumn="0"/>
+              <w:rPr>
+                <w:rFonts w:ascii="Aptos Narrow" w:eastAsia="Times New Roman" w:hAnsi="Aptos Narrow" w:cs="Times New Roman"/>
+                <w:color w:val="000000"/>
+                <w:lang w:bidi="he-IL"/>
+              </w:rPr>
+            </w:pPr>
+            <w:r>
+              <w:rPr>
+                <w:rFonts w:ascii="Aptos Narrow" w:eastAsia="Times New Roman" w:hAnsi="Aptos Narrow" w:cs="Times New Roman"/>
+                <w:color w:val="000000"/>
+                <w:lang w:bidi="he-IL"/>
+              </w:rPr>
+              <w:t>Final Train Accuracy (%)</w:t>
+            </w:r>
+          </w:p>
+        </w:tc>
+        <w:tc>
+          <w:tcPr>
+            <w:tcW w:w="2120" w:type="dxa"/>
+            <w:noWrap/>
+            <w:hideMark/>
+          </w:tcPr>
+          <w:p>
+            <w:pPr>
+              <w:cnfStyle w:val="100000000000" w:firstRow="1" w:lastRow="0" w:firstColumn="0" w:lastColumn="0" w:oddVBand="0" w:evenVBand="0" w:oddHBand="0" w:evenHBand="0" w:firstRowFirstColumn="0" w:firstRowLastColumn="0" w:lastRowFirstColumn="0" w:lastRowLastColumn="0"/>
+              <w:rPr>
+                <w:rFonts w:ascii="Aptos Narrow" w:eastAsia="Times New Roman" w:hAnsi="Aptos Narrow" w:cs="Times New Roman"/>
+                <w:color w:val="000000"/>
+                <w:lang w:bidi="he-IL"/>
+              </w:rPr>
+            </w:pPr>
+            <w:r>
+              <w:rPr>
+                <w:rFonts w:ascii="Aptos Narrow" w:eastAsia="Times New Roman" w:hAnsi="Aptos Narrow" w:cs="Times New Roman"/>
+                <w:color w:val="000000"/>
+                <w:lang w:bidi="he-IL"/>
+              </w:rPr>
+              <w:t>Final Test Accuracy (%)</w:t>
+            </w:r>
+          </w:p>
+        </w:tc>
+      </w:tr>
+      <w:tr>
+        <w:trPr>
+          <w:cnfStyle w:val="000000100000" w:firstRow="0" w:lastRow="0" w:firstColumn="0" w:lastColumn="0" w:oddVBand="0" w:evenVBand="0" w:oddHBand="1" w:evenHBand="0" w:firstRowFirstColumn="0" w:firstRowLastColumn="0" w:lastRowFirstColumn="0" w:lastRowLastColumn="0"/>
+          <w:trHeight w:val="288"/>
+          <w:jc w:val="center"/>
+        </w:trPr>
+        <w:tc>
+          <w:tcPr>
+            <w:cnfStyle w:val="001000000000" w:firstRow="0" w:lastRow="0" w:firstColumn="1" w:lastColumn="0" w:oddVBand="0" w:evenVBand="0" w:oddHBand="0" w:evenHBand="0" w:firstRowFirstColumn="0" w:firstRowLastColumn="0" w:lastRowFirstColumn="0" w:lastRowLastColumn="0"/>
+            <w:tcW w:w="1190" w:type="dxa"/>
+            <w:noWrap/>
+            <w:hideMark/>
+          </w:tcPr>
+          <w:p>
+            <w:pPr>
+              <w:rPr>
+                <w:rFonts w:ascii="Aptos Narrow" w:eastAsia="Times New Roman" w:hAnsi="Aptos Narrow" w:cs="Times New Roman"/>
+                <w:color w:val="000000"/>
+                <w:lang w:bidi="he-IL"/>
+              </w:rPr>
+            </w:pPr>
+            <w:r>
+              <w:rPr>
+                <w:rFonts w:ascii="Aptos Narrow" w:eastAsia="Times New Roman" w:hAnsi="Aptos Narrow" w:cs="Times New Roman"/>
+                <w:color w:val="000000"/>
+                <w:lang w:bidi="he-IL"/>
+              </w:rPr>
+              <w:t>Baseline</w:t>
+            </w:r>
+          </w:p>
+        </w:tc>
+        <w:tc>
+          <w:tcPr>
+            <w:tcW w:w="2200" w:type="dxa"/>
+            <w:noWrap/>
+            <w:hideMark/>
+          </w:tcPr>
+          <w:p>
+            <w:pPr>
+              <w:jc w:val="center"/>
+              <w:cnfStyle w:val="000000100000" w:firstRow="0" w:lastRow="0" w:firstColumn="0" w:lastColumn="0" w:oddVBand="0" w:evenVBand="0" w:oddHBand="1" w:evenHBand="0" w:firstRowFirstColumn="0" w:firstRowLastColumn="0" w:lastRowFirstColumn="0" w:lastRowLastColumn="0"/>
+              <w:rPr>
+                <w:rFonts w:ascii="Aptos Narrow" w:eastAsia="Times New Roman" w:hAnsi="Aptos Narrow" w:cs="Times New Roman"/>
+                <w:color w:val="000000"/>
+                <w:lang w:bidi="he-IL"/>
+              </w:rPr>
+            </w:pPr>
+            <w:r>
+              <w:rPr>
+                <w:rFonts w:ascii="Aptos Narrow" w:eastAsia="Times New Roman" w:hAnsi="Aptos Narrow" w:cs="Times New Roman"/>
+                <w:color w:val="000000"/>
+                <w:lang w:bidi="he-IL"/>
+              </w:rPr>
+              <w:t>97.82</w:t>
+            </w:r>
+          </w:p>
+        </w:tc>
+        <w:tc>
+          <w:tcPr>
+            <w:tcW w:w="2120" w:type="dxa"/>
+            <w:noWrap/>
+            <w:hideMark/>
+          </w:tcPr>
+          <w:p>
+            <w:pPr>
+              <w:jc w:val="center"/>
+              <w:cnfStyle w:val="000000100000" w:firstRow="0" w:lastRow="0" w:firstColumn="0" w:lastColumn="0" w:oddVBand="0" w:evenVBand="0" w:oddHBand="1" w:evenHBand="0" w:firstRowFirstColumn="0" w:firstRowLastColumn="0" w:lastRowFirstColumn="0" w:lastRowLastColumn="0"/>
+              <w:rPr>
+                <w:rFonts w:ascii="Aptos Narrow" w:eastAsia="Times New Roman" w:hAnsi="Aptos Narrow" w:cs="Times New Roman"/>
+                <w:color w:val="000000"/>
+                <w:lang w:bidi="he-IL"/>
+              </w:rPr>
+            </w:pPr>
+            <w:r>
+              <w:rPr>
+                <w:rFonts w:ascii="Aptos Narrow" w:eastAsia="Times New Roman" w:hAnsi="Aptos Narrow" w:cs="Times New Roman"/>
+                <w:color w:val="000000"/>
+                <w:lang w:bidi="he-IL"/>
+              </w:rPr>
+              <w:t>90.47</w:t>
+            </w:r>
+          </w:p>
+        </w:tc>
+      </w:tr>
+      <w:tr>
+        <w:trPr>
+          <w:trHeight w:val="288"/>
+          <w:jc w:val="center"/>
+        </w:trPr>
+        <w:tc>
+          <w:tcPr>
+            <w:cnfStyle w:val="001000000000" w:firstRow="0" w:lastRow="0" w:firstColumn="1" w:lastColumn="0" w:oddVBand="0" w:evenVBand="0" w:oddHBand="0" w:evenHBand="0" w:firstRowFirstColumn="0" w:firstRowLastColumn="0" w:lastRowFirstColumn="0" w:lastRowLastColumn="0"/>
+            <w:tcW w:w="1190" w:type="dxa"/>
+            <w:noWrap/>
+            <w:hideMark/>
+          </w:tcPr>
+          <w:p>
+            <w:pPr>
+              <w:rPr>
+                <w:rFonts w:ascii="Aptos Narrow" w:eastAsia="Times New Roman" w:hAnsi="Aptos Narrow" w:cs="Times New Roman"/>
+                <w:color w:val="000000"/>
+                <w:lang w:bidi="he-IL"/>
+              </w:rPr>
+            </w:pPr>
+            <w:r>
+              <w:rPr>
+                <w:rFonts w:ascii="Aptos Narrow" w:eastAsia="Times New Roman" w:hAnsi="Aptos Narrow" w:cs="Times New Roman"/>
+                <w:color w:val="000000"/>
+                <w:lang w:bidi="he-IL"/>
+              </w:rPr>
+              <w:t>Dropout</w:t>
+            </w:r>
+          </w:p>
+        </w:tc>
+        <w:tc>
+          <w:tcPr>
+            <w:tcW w:w="2200" w:type="dxa"/>
+            <w:noWrap/>
+            <w:hideMark/>
+          </w:tcPr>
+          <w:p>
+            <w:pPr>
+              <w:jc w:val="center"/>
+              <w:cnfStyle w:val="000000000000" w:firstRow="0" w:lastRow="0" w:firstColumn="0" w:lastColumn="0" w:oddVBand="0" w:evenVBand="0" w:oddHBand="0" w:evenHBand="0" w:firstRowFirstColumn="0" w:firstRowLastColumn="0" w:lastRowFirstColumn="0" w:lastRowLastColumn="0"/>
+              <w:rPr>
+                <w:rFonts w:ascii="Aptos Narrow" w:eastAsia="Times New Roman" w:hAnsi="Aptos Narrow" w:cs="Times New Roman"/>
+                <w:color w:val="000000"/>
+                <w:lang w:bidi="he-IL"/>
+              </w:rPr>
+            </w:pPr>
+            <w:r>
+              <w:rPr>
+                <w:rFonts w:ascii="Aptos Narrow" w:eastAsia="Times New Roman" w:hAnsi="Aptos Narrow" w:cs="Times New Roman"/>
+                <w:color w:val="000000"/>
+                <w:lang w:bidi="he-IL"/>
+              </w:rPr>
+              <w:t>94.71</w:t>
+            </w:r>
+          </w:p>
+        </w:tc>
+        <w:tc>
+          <w:tcPr>
+            <w:tcW w:w="2120" w:type="dxa"/>
+            <w:noWrap/>
+            <w:hideMark/>
+          </w:tcPr>
+          <w:p>
+            <w:pPr>
+              <w:jc w:val="center"/>
+              <w:cnfStyle w:val="000000000000" w:firstRow="0" w:lastRow="0" w:firstColumn="0" w:lastColumn="0" w:oddVBand="0" w:evenVBand="0" w:oddHBand="0" w:evenHBand="0" w:firstRowFirstColumn="0" w:firstRowLastColumn="0" w:lastRowFirstColumn="0" w:lastRowLastColumn="0"/>
+              <w:rPr>
+                <w:rFonts w:ascii="Aptos Narrow" w:eastAsia="Times New Roman" w:hAnsi="Aptos Narrow" w:cs="Times New Roman"/>
+                <w:color w:val="000000"/>
+                <w:lang w:bidi="he-IL"/>
+              </w:rPr>
+            </w:pPr>
+            <w:r>
+              <w:rPr>
+                <w:rFonts w:ascii="Aptos Narrow" w:eastAsia="Times New Roman" w:hAnsi="Aptos Narrow" w:cs="Times New Roman"/>
+                <w:color w:val="000000"/>
+                <w:lang w:bidi="he-IL"/>
+              </w:rPr>
+              <w:t>91.4</w:t>
+            </w:r>
+          </w:p>
+        </w:tc>
+      </w:tr>
+      <w:tr>
+        <w:trPr>
+          <w:cnfStyle w:val="000000100000" w:firstRow="0" w:lastRow="0" w:firstColumn="0" w:lastColumn="0" w:oddVBand="0" w:evenVBand="0" w:oddHBand="1" w:evenHBand="0" w:firstRowFirstColumn="0" w:firstRowLastColumn="0" w:lastRowFirstColumn="0" w:lastRowLastColumn="0"/>
+          <w:trHeight w:val="288"/>
+          <w:jc w:val="center"/>
+        </w:trPr>
+        <w:tc>
+          <w:tcPr>
+            <w:cnfStyle w:val="001000000000" w:firstRow="0" w:lastRow="0" w:firstColumn="1" w:lastColumn="0" w:oddVBand="0" w:evenVBand="0" w:oddHBand="0" w:evenHBand="0" w:firstRowFirstColumn="0" w:firstRowLastColumn="0" w:lastRowFirstColumn="0" w:lastRowLastColumn="0"/>
+            <w:tcW w:w="1190" w:type="dxa"/>
+            <w:noWrap/>
+            <w:hideMark/>
+          </w:tcPr>
+          <w:p>
+            <w:pPr>
+              <w:rPr>
+                <w:rFonts w:ascii="Aptos Narrow" w:eastAsia="Times New Roman" w:hAnsi="Aptos Narrow" w:cs="Times New Roman"/>
+                <w:color w:val="000000"/>
+                <w:lang w:bidi="he-IL"/>
+              </w:rPr>
+            </w:pPr>
+            <w:proofErr w:type="spellStart"/>
+            <w:r>
+              <w:rPr>
+                <w:rFonts w:ascii="Aptos Narrow" w:eastAsia="Times New Roman" w:hAnsi="Aptos Narrow" w:cs="Times New Roman"/>
+                <w:color w:val="000000"/>
+                <w:lang w:bidi="he-IL"/>
+              </w:rPr>
+              <w:t>WeightDecay</w:t>
+            </w:r>
+            <w:proofErr w:type="spellEnd"/>
+          </w:p>
+        </w:tc>
+        <w:tc>
+          <w:tcPr>
+            <w:tcW w:w="2200" w:type="dxa"/>
+            <w:noWrap/>
+            <w:hideMark/>
+          </w:tcPr>
+          <w:p>
+            <w:pPr>
+              <w:jc w:val="center"/>
+              <w:cnfStyle w:val="000000100000" w:firstRow="0" w:lastRow="0" w:firstColumn="0" w:lastColumn="0" w:oddVBand="0" w:evenVBand="0" w:oddHBand="1" w:evenHBand="0" w:firstRowFirstColumn="0" w:firstRowLastColumn="0" w:lastRowFirstColumn="0" w:lastRowLastColumn="0"/>
+              <w:rPr>
+                <w:rFonts w:ascii="Aptos Narrow" w:eastAsia="Times New Roman" w:hAnsi="Aptos Narrow" w:cs="Times New Roman"/>
+                <w:color w:val="000000"/>
+                <w:lang w:bidi="he-IL"/>
+              </w:rPr>
+            </w:pPr>
+            <w:r>
+              <w:rPr>
+                <w:rFonts w:ascii="Aptos Narrow" w:eastAsia="Times New Roman" w:hAnsi="Aptos Narrow" w:cs="Times New Roman"/>
+                <w:color w:val="000000"/>
+                <w:lang w:bidi="he-IL"/>
+              </w:rPr>
+              <w:t>95.35</w:t>
+            </w:r>
+          </w:p>
+        </w:tc>
+        <w:tc>
+          <w:tcPr>
+            <w:tcW w:w="2120" w:type="dxa"/>
+            <w:noWrap/>
+            <w:hideMark/>
+          </w:tcPr>
+          <w:p>
+            <w:pPr>
+              <w:jc w:val="center"/>
+              <w:cnfStyle w:val="000000100000" w:firstRow="0" w:lastRow="0" w:firstColumn="0" w:lastColumn="0" w:oddVBand="0" w:evenVBand="0" w:oddHBand="1" w:evenHBand="0" w:firstRowFirstColumn="0" w:firstRowLastColumn="0" w:lastRowFirstColumn="0" w:lastRowLastColumn="0"/>
+              <w:rPr>
+                <w:rFonts w:ascii="Aptos Narrow" w:eastAsia="Times New Roman" w:hAnsi="Aptos Narrow" w:cs="Times New Roman"/>
+                <w:color w:val="000000"/>
+                <w:lang w:bidi="he-IL"/>
+              </w:rPr>
+            </w:pPr>
+            <w:r>
+              <w:rPr>
+                <w:rFonts w:ascii="Aptos Narrow" w:eastAsia="Times New Roman" w:hAnsi="Aptos Narrow" w:cs="Times New Roman"/>
+                <w:color w:val="000000"/>
+                <w:lang w:bidi="he-IL"/>
+              </w:rPr>
+              <w:t>90.74</w:t>
+            </w:r>
+          </w:p>
+        </w:tc>
+      </w:tr>
+      <w:tr>
+        <w:trPr>
+          <w:trHeight w:val="300"/>
+          <w:jc w:val="center"/>
+        </w:trPr>
+        <w:tc>
+          <w:tcPr>
+            <w:cnfStyle w:val="001000000000" w:firstRow="0" w:lastRow="0" w:firstColumn="1" w:lastColumn="0" w:oddVBand="0" w:evenVBand="0" w:oddHBand="0" w:evenHBand="0" w:firstRowFirstColumn="0" w:firstRowLastColumn="0" w:lastRowFirstColumn="0" w:lastRowLastColumn="0"/>
+            <w:tcW w:w="1190" w:type="dxa"/>
+            <w:noWrap/>
+            <w:hideMark/>
+          </w:tcPr>
+          <w:p>
+            <w:pPr>
+              <w:rPr>
+                <w:rFonts w:ascii="Aptos Narrow" w:eastAsia="Times New Roman" w:hAnsi="Aptos Narrow" w:cs="Times New Roman"/>
+                <w:color w:val="000000"/>
+                <w:lang w:bidi="he-IL"/>
+              </w:rPr>
+            </w:pPr>
+            <w:proofErr w:type="spellStart"/>
+            <w:r>
+              <w:rPr>
+                <w:rFonts w:ascii="Aptos Narrow" w:eastAsia="Times New Roman" w:hAnsi="Aptos Narrow" w:cs="Times New Roman"/>
+                <w:color w:val="000000"/>
+                <w:lang w:bidi="he-IL"/>
+              </w:rPr>
+              <w:t>BatchNorm</w:t>
+            </w:r>
+            <w:proofErr w:type="spellEnd"/>
+          </w:p>
+        </w:tc>
+        <w:tc>
+          <w:tcPr>
+            <w:tcW w:w="2200" w:type="dxa"/>
+            <w:noWrap/>
+            <w:hideMark/>
+          </w:tcPr>
+          <w:p>
+            <w:pPr>
+              <w:jc w:val="center"/>
+              <w:cnfStyle w:val="000000000000" w:firstRow="0" w:lastRow="0" w:firstColumn="0" w:lastColumn="0" w:oddVBand="0" w:evenVBand="0" w:oddHBand="0" w:evenHBand="0" w:firstRowFirstColumn="0" w:firstRowLastColumn="0" w:lastRowFirstColumn="0" w:lastRowLastColumn="0"/>
+              <w:rPr>
+                <w:rFonts w:ascii="Aptos Narrow" w:eastAsia="Times New Roman" w:hAnsi="Aptos Narrow" w:cs="Times New Roman"/>
+                <w:color w:val="000000"/>
+                <w:lang w:bidi="he-IL"/>
+              </w:rPr>
+            </w:pPr>
+            <w:r>
+              <w:rPr>
+                <w:rFonts w:ascii="Aptos Narrow" w:eastAsia="Times New Roman" w:hAnsi="Aptos Narrow" w:cs="Times New Roman"/>
+                <w:color w:val="000000"/>
+                <w:lang w:bidi="he-IL"/>
+              </w:rPr>
+              <w:t>98.65</w:t>
+            </w:r>
+          </w:p>
+        </w:tc>
+        <w:tc>
+          <w:tcPr>
+            <w:tcW w:w="2120" w:type="dxa"/>
+            <w:noWrap/>
+            <w:hideMark/>
+          </w:tcPr>
+          <w:p>
+            <w:pPr>
+              <w:jc w:val="center"/>
+              <w:cnfStyle w:val="000000000000" w:firstRow="0" w:lastRow="0" w:firstColumn="0" w:lastColumn="0" w:oddVBand="0" w:evenVBand="0" w:oddHBand="0" w:evenHBand="0" w:firstRowFirstColumn="0" w:firstRowLastColumn="0" w:lastRowFirstColumn="0" w:lastRowLastColumn="0"/>
+              <w:rPr>
+                <w:rFonts w:ascii="Aptos Narrow" w:eastAsia="Times New Roman" w:hAnsi="Aptos Narrow" w:cs="Times New Roman"/>
+                <w:color w:val="000000"/>
+                <w:lang w:bidi="he-IL"/>
+              </w:rPr>
+            </w:pPr>
+            <w:r>
+              <w:rPr>
+                <w:rFonts w:ascii="Aptos Narrow" w:eastAsia="Times New Roman" w:hAnsi="Aptos Narrow" w:cs="Times New Roman"/>
+                <w:color w:val="000000"/>
+                <w:lang w:bidi="he-IL"/>
+              </w:rPr>
+              <w:t>91.08</w:t>
+            </w:r>
+          </w:p>
+        </w:tc>
+      </w:tr>
+    </w:tbl>
+    <w:p>
+      <w:pPr>
+        <w:jc w:val="center"/>
+        <w:rPr>
+          <w:b/>
+          <w:bCs/>
+          <w:i/>
+          <w:iCs/>
+          <w:sz w:val="18"/>
+          <w:szCs w:val="18"/>
+        </w:rPr>
+      </w:pPr>
+      <w:r>
+        <w:rPr>
+          <w:b/>
+          <w:bCs/>
+          <w:i/>
+          <w:iCs/>
+          <w:sz w:val="18"/>
+          <w:szCs w:val="18"/>
+        </w:rPr>
+        <w:t>Table 1: Train &amp; Test results on all four models</w:t>
+      </w:r>
+    </w:p>
+    <w:p>
+      <w:r>
+        <w:rPr>
+          <w:b/>
+          <w:bCs/>
           <w:noProof/>
         </w:rPr>
-        <w:lastRenderedPageBreak/>
         <w:drawing>
-          <wp:anchor distT="0" distB="0" distL="114300" distR="114300" simplePos="0" relativeHeight="251658752" behindDoc="0" locked="0" layoutInCell="1" allowOverlap="1" wp14:anchorId="68FC7C83" wp14:editId="45CC8C5B">
+          <wp:anchor distT="0" distB="0" distL="114300" distR="114300" simplePos="0" relativeHeight="251608576" behindDoc="0" locked="0" layoutInCell="1" allowOverlap="1" wp14:anchorId="621989D4" wp14:editId="1E97C228">
             <wp:simplePos x="0" y="0"/>
             <wp:positionH relativeFrom="column">
-              <wp:posOffset>0</wp:posOffset>
+              <wp:posOffset>2946400</wp:posOffset>
             </wp:positionH>
             <wp:positionV relativeFrom="paragraph">
-              <wp:posOffset>0</wp:posOffset>
+              <wp:posOffset>647065</wp:posOffset>
             </wp:positionV>
-            <wp:extent cx="5585460" cy="2438400"/>
+            <wp:extent cx="3168650" cy="2266950"/>
             <wp:effectExtent l="0" t="0" r="0" b="0"/>
             <wp:wrapSquare wrapText="bothSides"/>
-            <wp:docPr id="335872511" name="Picture 2"/>
+            <wp:docPr id="525801716" name="Picture 2"/>
             <wp:cNvGraphicFramePr>
               <a:graphicFrameLocks xmlns:a="http://schemas.openxmlformats.org/drawingml/2006/main" noChangeAspect="1"/>
             </wp:cNvGraphicFramePr>
@@ -1386,14 +2587,14 @@
                     </pic:cNvPicPr>
                   </pic:nvPicPr>
                   <pic:blipFill rotWithShape="1">
-                    <a:blip r:embed="rId7">
+                    <a:blip r:embed="rId10">
                       <a:extLst>
                         <a:ext uri="{28A0092B-C50C-407E-A947-70E740481C1C}">
                           <a14:useLocalDpi xmlns:a14="http://schemas.microsoft.com/office/drawing/2010/main" val="0"/>
                         </a:ext>
                       </a:extLst>
                     </a:blip>
-                    <a:srcRect l="1" r="-274" b="70316"/>
+                    <a:srcRect t="1802" b="2702"/>
                     <a:stretch>
                       <a:fillRect/>
                     </a:stretch>
@@ -1401,7 +2602,7 @@
                   <pic:spPr bwMode="auto">
                     <a:xfrm>
                       <a:off x="0" y="0"/>
-                      <a:ext cx="5585460" cy="2438400"/>
+                      <a:ext cx="3168650" cy="2266950"/>
                     </a:xfrm>
                     <a:prstGeom prst="rect">
                       <a:avLst/>
@@ -1428,8 +2629,1244 @@
           </wp:anchor>
         </w:drawing>
       </w:r>
+      <w:r>
+        <w:rPr>
+          <w:noProof/>
+        </w:rPr>
+        <w:drawing>
+          <wp:anchor distT="0" distB="0" distL="114300" distR="114300" simplePos="0" relativeHeight="251594240" behindDoc="0" locked="0" layoutInCell="1" allowOverlap="1" wp14:anchorId="19C76A40" wp14:editId="654655A2">
+            <wp:simplePos x="0" y="0"/>
+            <wp:positionH relativeFrom="column">
+              <wp:posOffset>-387350</wp:posOffset>
+            </wp:positionH>
+            <wp:positionV relativeFrom="paragraph">
+              <wp:posOffset>628015</wp:posOffset>
+            </wp:positionV>
+            <wp:extent cx="3219450" cy="2298700"/>
+            <wp:effectExtent l="0" t="0" r="0" b="6350"/>
+            <wp:wrapSquare wrapText="bothSides"/>
+            <wp:docPr id="1304335531" name="Picture 1"/>
+            <wp:cNvGraphicFramePr>
+              <a:graphicFrameLocks xmlns:a="http://schemas.openxmlformats.org/drawingml/2006/main" noChangeAspect="1"/>
+            </wp:cNvGraphicFramePr>
+            <a:graphic xmlns:a="http://schemas.openxmlformats.org/drawingml/2006/main">
+              <a:graphicData uri="http://schemas.openxmlformats.org/drawingml/2006/picture">
+                <pic:pic xmlns:pic="http://schemas.openxmlformats.org/drawingml/2006/picture">
+                  <pic:nvPicPr>
+                    <pic:cNvPr id="0" name="Picture 1"/>
+                    <pic:cNvPicPr>
+                      <a:picLocks noChangeAspect="1" noChangeArrowheads="1"/>
+                    </pic:cNvPicPr>
+                  </pic:nvPicPr>
+                  <pic:blipFill rotWithShape="1">
+                    <a:blip r:embed="rId11">
+                      <a:extLst>
+                        <a:ext uri="{28A0092B-C50C-407E-A947-70E740481C1C}">
+                          <a14:useLocalDpi xmlns:a14="http://schemas.microsoft.com/office/drawing/2010/main" val="0"/>
+                        </a:ext>
+                      </a:extLst>
+                    </a:blip>
+                    <a:srcRect t="2327" b="2395"/>
+                    <a:stretch>
+                      <a:fillRect/>
+                    </a:stretch>
+                  </pic:blipFill>
+                  <pic:spPr bwMode="auto">
+                    <a:xfrm>
+                      <a:off x="0" y="0"/>
+                      <a:ext cx="3219450" cy="2298700"/>
+                    </a:xfrm>
+                    <a:prstGeom prst="rect">
+                      <a:avLst/>
+                    </a:prstGeom>
+                    <a:noFill/>
+                    <a:ln>
+                      <a:noFill/>
+                    </a:ln>
+                    <a:extLst>
+                      <a:ext uri="{53640926-AAD7-44D8-BBD7-CCE9431645EC}">
+                        <a14:shadowObscured xmlns:a14="http://schemas.microsoft.com/office/drawing/2010/main"/>
+                      </a:ext>
+                    </a:extLst>
+                  </pic:spPr>
+                </pic:pic>
+              </a:graphicData>
+            </a:graphic>
+            <wp14:sizeRelH relativeFrom="margin">
+              <wp14:pctWidth>0</wp14:pctWidth>
+            </wp14:sizeRelH>
+            <wp14:sizeRelV relativeFrom="margin">
+              <wp14:pctHeight>0</wp14:pctHeight>
+            </wp14:sizeRelV>
+          </wp:anchor>
+        </w:drawing>
+      </w:r>
+      <w:r>
+        <w:t>Figure 1-4 below show Train &amp; Test accuracies plotted on the same graph for each model (separate graphs for Train &amp; Test are presented in the appendix):</w:t>
+      </w:r>
+    </w:p>
+    <w:p>
+      <w:pPr>
+        <w:rPr>
+          <w:i/>
+          <w:iCs/>
+        </w:rPr>
+      </w:pPr>
+      <w:r>
+        <w:rPr>
+          <w:b/>
+          <w:bCs/>
+          <w:sz w:val="18"/>
+          <w:szCs w:val="18"/>
+        </w:rPr>
+        <w:t xml:space="preserve">                                                                                                              </w:t>
+      </w:r>
+      <w:r>
+        <w:rPr>
+          <w:b/>
+          <w:bCs/>
+          <w:i/>
+          <w:iCs/>
+          <w:sz w:val="18"/>
+          <w:szCs w:val="18"/>
+        </w:rPr>
+        <w:t xml:space="preserve">Figure 1: Convergence Graph for baseline LeNet-5                           </w:t>
+      </w:r>
+      <w:r>
+        <w:rPr>
+          <w:b/>
+          <w:bCs/>
+          <w:i/>
+          <w:iCs/>
+          <w:sz w:val="18"/>
+          <w:szCs w:val="18"/>
+        </w:rPr>
+        <w:t xml:space="preserve">  </w:t>
+      </w:r>
+      <w:r>
+        <w:rPr>
+          <w:b/>
+          <w:bCs/>
+          <w:i/>
+          <w:iCs/>
+          <w:sz w:val="18"/>
+          <w:szCs w:val="18"/>
+        </w:rPr>
+        <w:t xml:space="preserve">       </w:t>
+      </w:r>
+      <w:r>
+        <w:rPr>
+          <w:b/>
+          <w:bCs/>
+          <w:i/>
+          <w:iCs/>
+          <w:sz w:val="18"/>
+          <w:szCs w:val="18"/>
+        </w:rPr>
+        <w:t xml:space="preserve">Figure </w:t>
+      </w:r>
+      <w:r>
+        <w:rPr>
+          <w:b/>
+          <w:bCs/>
+          <w:i/>
+          <w:iCs/>
+          <w:sz w:val="18"/>
+          <w:szCs w:val="18"/>
+        </w:rPr>
+        <w:t>2</w:t>
+      </w:r>
+      <w:r>
+        <w:rPr>
+          <w:b/>
+          <w:bCs/>
+          <w:i/>
+          <w:iCs/>
+          <w:sz w:val="18"/>
+          <w:szCs w:val="18"/>
+        </w:rPr>
+        <w:t xml:space="preserve">: Convergence Graph for </w:t>
+      </w:r>
+      <w:proofErr w:type="spellStart"/>
+      <w:r>
+        <w:rPr>
+          <w:b/>
+          <w:bCs/>
+          <w:i/>
+          <w:iCs/>
+          <w:sz w:val="18"/>
+          <w:szCs w:val="18"/>
+        </w:rPr>
+        <w:t>BatchNorm</w:t>
+      </w:r>
+      <w:proofErr w:type="spellEnd"/>
+    </w:p>
+    <w:p>
+      <w:pPr>
+        <w:rPr>
+          <w:b/>
+          <w:bCs/>
+          <w:sz w:val="18"/>
+          <w:szCs w:val="18"/>
+        </w:rPr>
+      </w:pPr>
+      <w:r>
+        <w:rPr>
+          <w:b/>
+          <w:bCs/>
+          <w:noProof/>
+        </w:rPr>
+        <w:lastRenderedPageBreak/>
+        <w:drawing>
+          <wp:anchor distT="0" distB="0" distL="114300" distR="114300" simplePos="0" relativeHeight="251639296" behindDoc="1" locked="0" layoutInCell="1" allowOverlap="1" wp14:anchorId="6A8C7065" wp14:editId="70060D4F">
+            <wp:simplePos x="0" y="0"/>
+            <wp:positionH relativeFrom="column">
+              <wp:posOffset>2997200</wp:posOffset>
+            </wp:positionH>
+            <wp:positionV relativeFrom="paragraph">
+              <wp:posOffset>222250</wp:posOffset>
+            </wp:positionV>
+            <wp:extent cx="3295650" cy="2413000"/>
+            <wp:effectExtent l="0" t="0" r="0" b="6350"/>
+            <wp:wrapTight wrapText="bothSides">
+              <wp:wrapPolygon edited="0">
+                <wp:start x="0" y="0"/>
+                <wp:lineTo x="0" y="21486"/>
+                <wp:lineTo x="21475" y="21486"/>
+                <wp:lineTo x="21475" y="0"/>
+                <wp:lineTo x="0" y="0"/>
+              </wp:wrapPolygon>
+            </wp:wrapTight>
+            <wp:docPr id="89488482" name="Picture 4"/>
+            <wp:cNvGraphicFramePr>
+              <a:graphicFrameLocks xmlns:a="http://schemas.openxmlformats.org/drawingml/2006/main" noChangeAspect="1"/>
+            </wp:cNvGraphicFramePr>
+            <a:graphic xmlns:a="http://schemas.openxmlformats.org/drawingml/2006/main">
+              <a:graphicData uri="http://schemas.openxmlformats.org/drawingml/2006/picture">
+                <pic:pic xmlns:pic="http://schemas.openxmlformats.org/drawingml/2006/picture">
+                  <pic:nvPicPr>
+                    <pic:cNvPr id="0" name="Picture 4"/>
+                    <pic:cNvPicPr>
+                      <a:picLocks noChangeAspect="1" noChangeArrowheads="1"/>
+                    </pic:cNvPicPr>
+                  </pic:nvPicPr>
+                  <pic:blipFill rotWithShape="1">
+                    <a:blip r:embed="rId12">
+                      <a:extLst>
+                        <a:ext uri="{28A0092B-C50C-407E-A947-70E740481C1C}">
+                          <a14:useLocalDpi xmlns:a14="http://schemas.microsoft.com/office/drawing/2010/main" val="0"/>
+                        </a:ext>
+                      </a:extLst>
+                    </a:blip>
+                    <a:srcRect b="2288"/>
+                    <a:stretch>
+                      <a:fillRect/>
+                    </a:stretch>
+                  </pic:blipFill>
+                  <pic:spPr bwMode="auto">
+                    <a:xfrm>
+                      <a:off x="0" y="0"/>
+                      <a:ext cx="3295650" cy="2413000"/>
+                    </a:xfrm>
+                    <a:prstGeom prst="rect">
+                      <a:avLst/>
+                    </a:prstGeom>
+                    <a:noFill/>
+                    <a:ln>
+                      <a:noFill/>
+                    </a:ln>
+                    <a:extLst>
+                      <a:ext uri="{53640926-AAD7-44D8-BBD7-CCE9431645EC}">
+                        <a14:shadowObscured xmlns:a14="http://schemas.microsoft.com/office/drawing/2010/main"/>
+                      </a:ext>
+                    </a:extLst>
+                  </pic:spPr>
+                </pic:pic>
+              </a:graphicData>
+            </a:graphic>
+            <wp14:sizeRelH relativeFrom="margin">
+              <wp14:pctWidth>0</wp14:pctWidth>
+            </wp14:sizeRelH>
+            <wp14:sizeRelV relativeFrom="margin">
+              <wp14:pctHeight>0</wp14:pctHeight>
+            </wp14:sizeRelV>
+          </wp:anchor>
+        </w:drawing>
+      </w:r>
+      <w:r>
+        <w:rPr>
+          <w:b/>
+          <w:bCs/>
+          <w:noProof/>
+          <w:sz w:val="18"/>
+          <w:szCs w:val="18"/>
+        </w:rPr>
+        <w:drawing>
+          <wp:anchor distT="0" distB="0" distL="114300" distR="114300" simplePos="0" relativeHeight="251622912" behindDoc="0" locked="0" layoutInCell="1" allowOverlap="1" wp14:anchorId="3949B3E1" wp14:editId="354FAB16">
+            <wp:simplePos x="0" y="0"/>
+            <wp:positionH relativeFrom="column">
+              <wp:posOffset>-444500</wp:posOffset>
+            </wp:positionH>
+            <wp:positionV relativeFrom="paragraph">
+              <wp:posOffset>228600</wp:posOffset>
+            </wp:positionV>
+            <wp:extent cx="3289300" cy="2413000"/>
+            <wp:effectExtent l="0" t="0" r="6350" b="6350"/>
+            <wp:wrapSquare wrapText="bothSides"/>
+            <wp:docPr id="2069850387" name="Picture 3"/>
+            <wp:cNvGraphicFramePr>
+              <a:graphicFrameLocks xmlns:a="http://schemas.openxmlformats.org/drawingml/2006/main" noChangeAspect="1"/>
+            </wp:cNvGraphicFramePr>
+            <a:graphic xmlns:a="http://schemas.openxmlformats.org/drawingml/2006/main">
+              <a:graphicData uri="http://schemas.openxmlformats.org/drawingml/2006/picture">
+                <pic:pic xmlns:pic="http://schemas.openxmlformats.org/drawingml/2006/picture">
+                  <pic:nvPicPr>
+                    <pic:cNvPr id="0" name="Picture 3"/>
+                    <pic:cNvPicPr>
+                      <a:picLocks noChangeAspect="1" noChangeArrowheads="1"/>
+                    </pic:cNvPicPr>
+                  </pic:nvPicPr>
+                  <pic:blipFill rotWithShape="1">
+                    <a:blip r:embed="rId13">
+                      <a:extLst>
+                        <a:ext uri="{28A0092B-C50C-407E-A947-70E740481C1C}">
+                          <a14:useLocalDpi xmlns:a14="http://schemas.microsoft.com/office/drawing/2010/main" val="0"/>
+                        </a:ext>
+                      </a:extLst>
+                    </a:blip>
+                    <a:srcRect b="2112"/>
+                    <a:stretch>
+                      <a:fillRect/>
+                    </a:stretch>
+                  </pic:blipFill>
+                  <pic:spPr bwMode="auto">
+                    <a:xfrm>
+                      <a:off x="0" y="0"/>
+                      <a:ext cx="3289300" cy="2413000"/>
+                    </a:xfrm>
+                    <a:prstGeom prst="rect">
+                      <a:avLst/>
+                    </a:prstGeom>
+                    <a:noFill/>
+                    <a:ln>
+                      <a:noFill/>
+                    </a:ln>
+                    <a:extLst>
+                      <a:ext uri="{53640926-AAD7-44D8-BBD7-CCE9431645EC}">
+                        <a14:shadowObscured xmlns:a14="http://schemas.microsoft.com/office/drawing/2010/main"/>
+                      </a:ext>
+                    </a:extLst>
+                  </pic:spPr>
+                </pic:pic>
+              </a:graphicData>
+            </a:graphic>
+            <wp14:sizeRelH relativeFrom="margin">
+              <wp14:pctWidth>0</wp14:pctWidth>
+            </wp14:sizeRelH>
+            <wp14:sizeRelV relativeFrom="margin">
+              <wp14:pctHeight>0</wp14:pctHeight>
+            </wp14:sizeRelV>
+          </wp:anchor>
+        </w:drawing>
+      </w:r>
+    </w:p>
+    <w:p>
+      <w:pPr>
+        <w:rPr>
+          <w:i/>
+          <w:iCs/>
+        </w:rPr>
+      </w:pPr>
+      <w:r>
+        <w:rPr>
+          <w:b/>
+          <w:bCs/>
+          <w:i/>
+          <w:iCs/>
+          <w:sz w:val="18"/>
+          <w:szCs w:val="18"/>
+        </w:rPr>
+        <w:t xml:space="preserve">Figure 1: Convergence Graph for baseline </w:t>
+      </w:r>
+      <w:r>
+        <w:rPr>
+          <w:b/>
+          <w:bCs/>
+          <w:i/>
+          <w:iCs/>
+          <w:sz w:val="18"/>
+          <w:szCs w:val="18"/>
+        </w:rPr>
+        <w:t>Dropout</w:t>
+      </w:r>
+      <w:r>
+        <w:rPr>
+          <w:b/>
+          <w:bCs/>
+          <w:i/>
+          <w:iCs/>
+          <w:sz w:val="18"/>
+          <w:szCs w:val="18"/>
+        </w:rPr>
+        <w:t xml:space="preserve">                           </w:t>
+      </w:r>
+      <w:r>
+        <w:rPr>
+          <w:b/>
+          <w:bCs/>
+          <w:i/>
+          <w:iCs/>
+          <w:sz w:val="18"/>
+          <w:szCs w:val="18"/>
+        </w:rPr>
+        <w:t xml:space="preserve">  </w:t>
+      </w:r>
+      <w:r>
+        <w:rPr>
+          <w:b/>
+          <w:bCs/>
+          <w:i/>
+          <w:iCs/>
+          <w:sz w:val="18"/>
+          <w:szCs w:val="18"/>
+        </w:rPr>
+        <w:t xml:space="preserve">       Figure 2: Convergence Graph for </w:t>
+      </w:r>
+      <w:proofErr w:type="spellStart"/>
+      <w:r>
+        <w:rPr>
+          <w:b/>
+          <w:bCs/>
+          <w:i/>
+          <w:iCs/>
+          <w:sz w:val="18"/>
+          <w:szCs w:val="18"/>
+        </w:rPr>
+        <w:t>WeightDecay</w:t>
+      </w:r>
+      <w:proofErr w:type="spellEnd"/>
+    </w:p>
+    <w:p>
+      <w:pPr>
+        <w:rPr>
+          <w:i/>
+          <w:iCs/>
+        </w:rPr>
+      </w:pPr>
+    </w:p>
+    <w:p>
+      <w:pPr>
+        <w:rPr>
+          <w:b/>
+          <w:bCs/>
+        </w:rPr>
+      </w:pPr>
+      <w:r>
+        <w:rPr>
+          <w:b/>
+          <w:bCs/>
+        </w:rPr>
+        <w:t>Discussion</w:t>
+      </w:r>
+    </w:p>
+    <w:p>
+      <w:r>
+        <w:t xml:space="preserve">The baseline LeNet-5 model achieves high training accuracy and reaches a solid test </w:t>
+      </w:r>
+      <w:proofErr w:type="gramStart"/>
+      <w:r>
+        <w:t>accuracy, but</w:t>
+      </w:r>
+      <w:proofErr w:type="gramEnd"/>
+      <w:r>
+        <w:t xml:space="preserve"> shows clear overfitting: the training curve rises steadily toward ~98%, while the test curve plateaus around ~90–91%.</w:t>
+      </w:r>
+    </w:p>
+    <w:p>
+      <w:r>
+        <w:t>The Dropout configuration reduces this overfitting effect. Its training accuracy remains significantly lower than the baseline across all epochs, while the test accuracy improves slightly. The train–test gap remains smaller, demonstrating the expected regularization effect.</w:t>
+      </w:r>
+    </w:p>
+    <w:p>
+      <w:r>
+        <w:t>Weight Decay exhibits a similar improvement in generalization. Its training curve sits between the baseline and dropout curves, while its test performance stabilizes close to dropout. The reduced gap and smoother curve indicate more controlled weight growth.</w:t>
+      </w:r>
+    </w:p>
+    <w:p>
+      <w:r>
+        <w:t xml:space="preserve">Batch Normalization converges the fastest and reaches the highest overall accuracy. Although it does not remove overfitting, it consistently produces the strongest test results and improves optimization efficiency, particularly in the early </w:t>
+      </w:r>
+      <w:proofErr w:type="gramStart"/>
+      <w:r>
+        <w:t>epochs</w:t>
+      </w:r>
+      <w:proofErr w:type="gramEnd"/>
+      <w:r>
+        <w:t>.</w:t>
+      </w:r>
+    </w:p>
+    <w:p>
+      <w:r>
+        <w:t xml:space="preserve">Overall, all three regularization methods outperform the baseline in terms of generalization, with </w:t>
+      </w:r>
+      <w:proofErr w:type="spellStart"/>
+      <w:r>
+        <w:t>BatchNorm</w:t>
+      </w:r>
+      <w:proofErr w:type="spellEnd"/>
+      <w:r>
+        <w:t xml:space="preserve"> producing the highest final test accuracy, while Dropout provides the smallest train–test gap.</w:t>
+      </w:r>
     </w:p>
     <w:p/>
+    <w:p/>
+    <w:p/>
+    <w:p/>
+    <w:p>
+      <w:pPr>
+        <w:pStyle w:val="Heading1"/>
+      </w:pPr>
+      <w:r>
+        <w:lastRenderedPageBreak/>
+        <w:t>Appendix</w:t>
+      </w:r>
+    </w:p>
+    <w:p/>
+    <w:p>
+      <w:pPr>
+        <w:rPr>
+          <w:b/>
+          <w:bCs/>
+        </w:rPr>
+      </w:pPr>
+      <w:r>
+        <w:rPr>
+          <w:b/>
+          <w:bCs/>
+          <w:noProof/>
+        </w:rPr>
+        <w:drawing>
+          <wp:anchor distT="0" distB="0" distL="114300" distR="114300" simplePos="0" relativeHeight="251670016" behindDoc="0" locked="0" layoutInCell="1" allowOverlap="1" wp14:anchorId="14113056" wp14:editId="1BBC5244">
+            <wp:simplePos x="0" y="0"/>
+            <wp:positionH relativeFrom="column">
+              <wp:posOffset>3162300</wp:posOffset>
+            </wp:positionH>
+            <wp:positionV relativeFrom="paragraph">
+              <wp:posOffset>304800</wp:posOffset>
+            </wp:positionV>
+            <wp:extent cx="2762250" cy="2069465"/>
+            <wp:effectExtent l="0" t="0" r="0" b="6985"/>
+            <wp:wrapSquare wrapText="bothSides"/>
+            <wp:docPr id="2131007199" name="Picture 6"/>
+            <wp:cNvGraphicFramePr>
+              <a:graphicFrameLocks xmlns:a="http://schemas.openxmlformats.org/drawingml/2006/main" noChangeAspect="1"/>
+            </wp:cNvGraphicFramePr>
+            <a:graphic xmlns:a="http://schemas.openxmlformats.org/drawingml/2006/main">
+              <a:graphicData uri="http://schemas.openxmlformats.org/drawingml/2006/picture">
+                <pic:pic xmlns:pic="http://schemas.openxmlformats.org/drawingml/2006/picture">
+                  <pic:nvPicPr>
+                    <pic:cNvPr id="0" name="Picture 6"/>
+                    <pic:cNvPicPr>
+                      <a:picLocks noChangeAspect="1" noChangeArrowheads="1"/>
+                    </pic:cNvPicPr>
+                  </pic:nvPicPr>
+                  <pic:blipFill>
+                    <a:blip r:embed="rId14">
+                      <a:extLst>
+                        <a:ext uri="{28A0092B-C50C-407E-A947-70E740481C1C}">
+                          <a14:useLocalDpi xmlns:a14="http://schemas.microsoft.com/office/drawing/2010/main" val="0"/>
+                        </a:ext>
+                      </a:extLst>
+                    </a:blip>
+                    <a:srcRect/>
+                    <a:stretch>
+                      <a:fillRect/>
+                    </a:stretch>
+                  </pic:blipFill>
+                  <pic:spPr bwMode="auto">
+                    <a:xfrm>
+                      <a:off x="0" y="0"/>
+                      <a:ext cx="2762250" cy="2069465"/>
+                    </a:xfrm>
+                    <a:prstGeom prst="rect">
+                      <a:avLst/>
+                    </a:prstGeom>
+                    <a:noFill/>
+                    <a:ln>
+                      <a:noFill/>
+                    </a:ln>
+                  </pic:spPr>
+                </pic:pic>
+              </a:graphicData>
+            </a:graphic>
+            <wp14:sizeRelH relativeFrom="margin">
+              <wp14:pctWidth>0</wp14:pctWidth>
+            </wp14:sizeRelH>
+            <wp14:sizeRelV relativeFrom="margin">
+              <wp14:pctHeight>0</wp14:pctHeight>
+            </wp14:sizeRelV>
+          </wp:anchor>
+        </w:drawing>
+      </w:r>
+      <w:r>
+        <w:rPr>
+          <w:b/>
+          <w:bCs/>
+          <w:noProof/>
+        </w:rPr>
+        <w:drawing>
+          <wp:anchor distT="0" distB="0" distL="114300" distR="114300" simplePos="0" relativeHeight="251655680" behindDoc="0" locked="0" layoutInCell="1" allowOverlap="1" wp14:anchorId="0FDE56EA" wp14:editId="036A9C1B">
+            <wp:simplePos x="0" y="0"/>
+            <wp:positionH relativeFrom="column">
+              <wp:posOffset>0</wp:posOffset>
+            </wp:positionH>
+            <wp:positionV relativeFrom="paragraph">
+              <wp:posOffset>317500</wp:posOffset>
+            </wp:positionV>
+            <wp:extent cx="2806700" cy="2103120"/>
+            <wp:effectExtent l="0" t="0" r="0" b="0"/>
+            <wp:wrapSquare wrapText="bothSides"/>
+            <wp:docPr id="824382931" name="Picture 5"/>
+            <wp:cNvGraphicFramePr>
+              <a:graphicFrameLocks xmlns:a="http://schemas.openxmlformats.org/drawingml/2006/main" noChangeAspect="1"/>
+            </wp:cNvGraphicFramePr>
+            <a:graphic xmlns:a="http://schemas.openxmlformats.org/drawingml/2006/main">
+              <a:graphicData uri="http://schemas.openxmlformats.org/drawingml/2006/picture">
+                <pic:pic xmlns:pic="http://schemas.openxmlformats.org/drawingml/2006/picture">
+                  <pic:nvPicPr>
+                    <pic:cNvPr id="0" name="Picture 5"/>
+                    <pic:cNvPicPr>
+                      <a:picLocks noChangeAspect="1" noChangeArrowheads="1"/>
+                    </pic:cNvPicPr>
+                  </pic:nvPicPr>
+                  <pic:blipFill>
+                    <a:blip r:embed="rId15">
+                      <a:extLst>
+                        <a:ext uri="{28A0092B-C50C-407E-A947-70E740481C1C}">
+                          <a14:useLocalDpi xmlns:a14="http://schemas.microsoft.com/office/drawing/2010/main" val="0"/>
+                        </a:ext>
+                      </a:extLst>
+                    </a:blip>
+                    <a:srcRect/>
+                    <a:stretch>
+                      <a:fillRect/>
+                    </a:stretch>
+                  </pic:blipFill>
+                  <pic:spPr bwMode="auto">
+                    <a:xfrm>
+                      <a:off x="0" y="0"/>
+                      <a:ext cx="2806700" cy="2103120"/>
+                    </a:xfrm>
+                    <a:prstGeom prst="rect">
+                      <a:avLst/>
+                    </a:prstGeom>
+                    <a:noFill/>
+                    <a:ln>
+                      <a:noFill/>
+                    </a:ln>
+                  </pic:spPr>
+                </pic:pic>
+              </a:graphicData>
+            </a:graphic>
+            <wp14:sizeRelH relativeFrom="margin">
+              <wp14:pctWidth>0</wp14:pctWidth>
+            </wp14:sizeRelH>
+            <wp14:sizeRelV relativeFrom="margin">
+              <wp14:pctHeight>0</wp14:pctHeight>
+            </wp14:sizeRelV>
+          </wp:anchor>
+        </w:drawing>
+      </w:r>
+      <w:r>
+        <w:rPr>
+          <w:b/>
+          <w:bCs/>
+        </w:rPr>
+        <w:t>Convergence Graphs for baseline LeNet-5:</w:t>
+      </w:r>
+    </w:p>
+    <w:p>
+      <w:pPr>
+        <w:rPr>
+          <w:b/>
+          <w:bCs/>
+        </w:rPr>
+      </w:pPr>
+    </w:p>
+    <w:p>
+      <w:pPr>
+        <w:rPr>
+          <w:b/>
+          <w:bCs/>
+        </w:rPr>
+      </w:pPr>
+      <w:r>
+        <w:rPr>
+          <w:b/>
+          <w:bCs/>
+          <w:noProof/>
+        </w:rPr>
+        <w:drawing>
+          <wp:anchor distT="0" distB="0" distL="114300" distR="114300" simplePos="0" relativeHeight="251703808" behindDoc="0" locked="0" layoutInCell="1" allowOverlap="1" wp14:anchorId="31111CFE" wp14:editId="5C950E90">
+            <wp:simplePos x="0" y="0"/>
+            <wp:positionH relativeFrom="column">
+              <wp:posOffset>3124200</wp:posOffset>
+            </wp:positionH>
+            <wp:positionV relativeFrom="paragraph">
+              <wp:posOffset>307340</wp:posOffset>
+            </wp:positionV>
+            <wp:extent cx="2819400" cy="2112645"/>
+            <wp:effectExtent l="0" t="0" r="0" b="1905"/>
+            <wp:wrapSquare wrapText="bothSides"/>
+            <wp:docPr id="1010386923" name="Picture 8"/>
+            <wp:cNvGraphicFramePr>
+              <a:graphicFrameLocks xmlns:a="http://schemas.openxmlformats.org/drawingml/2006/main" noChangeAspect="1"/>
+            </wp:cNvGraphicFramePr>
+            <a:graphic xmlns:a="http://schemas.openxmlformats.org/drawingml/2006/main">
+              <a:graphicData uri="http://schemas.openxmlformats.org/drawingml/2006/picture">
+                <pic:pic xmlns:pic="http://schemas.openxmlformats.org/drawingml/2006/picture">
+                  <pic:nvPicPr>
+                    <pic:cNvPr id="0" name="Picture 8"/>
+                    <pic:cNvPicPr>
+                      <a:picLocks noChangeAspect="1" noChangeArrowheads="1"/>
+                    </pic:cNvPicPr>
+                  </pic:nvPicPr>
+                  <pic:blipFill>
+                    <a:blip r:embed="rId16">
+                      <a:extLst>
+                        <a:ext uri="{28A0092B-C50C-407E-A947-70E740481C1C}">
+                          <a14:useLocalDpi xmlns:a14="http://schemas.microsoft.com/office/drawing/2010/main" val="0"/>
+                        </a:ext>
+                      </a:extLst>
+                    </a:blip>
+                    <a:srcRect/>
+                    <a:stretch>
+                      <a:fillRect/>
+                    </a:stretch>
+                  </pic:blipFill>
+                  <pic:spPr bwMode="auto">
+                    <a:xfrm>
+                      <a:off x="0" y="0"/>
+                      <a:ext cx="2819400" cy="2112645"/>
+                    </a:xfrm>
+                    <a:prstGeom prst="rect">
+                      <a:avLst/>
+                    </a:prstGeom>
+                    <a:noFill/>
+                    <a:ln>
+                      <a:noFill/>
+                    </a:ln>
+                  </pic:spPr>
+                </pic:pic>
+              </a:graphicData>
+            </a:graphic>
+            <wp14:sizeRelH relativeFrom="margin">
+              <wp14:pctWidth>0</wp14:pctWidth>
+            </wp14:sizeRelH>
+            <wp14:sizeRelV relativeFrom="margin">
+              <wp14:pctHeight>0</wp14:pctHeight>
+            </wp14:sizeRelV>
+          </wp:anchor>
+        </w:drawing>
+      </w:r>
+      <w:r>
+        <w:rPr>
+          <w:b/>
+          <w:bCs/>
+          <w:noProof/>
+        </w:rPr>
+        <w:drawing>
+          <wp:anchor distT="0" distB="0" distL="114300" distR="114300" simplePos="0" relativeHeight="251689472" behindDoc="0" locked="0" layoutInCell="1" allowOverlap="1" wp14:anchorId="07FADC13" wp14:editId="4287FD44">
+            <wp:simplePos x="0" y="0"/>
+            <wp:positionH relativeFrom="column">
+              <wp:posOffset>-82550</wp:posOffset>
+            </wp:positionH>
+            <wp:positionV relativeFrom="paragraph">
+              <wp:posOffset>320675</wp:posOffset>
+            </wp:positionV>
+            <wp:extent cx="2832100" cy="2122170"/>
+            <wp:effectExtent l="0" t="0" r="6350" b="0"/>
+            <wp:wrapSquare wrapText="bothSides"/>
+            <wp:docPr id="7421898" name="Picture 7"/>
+            <wp:cNvGraphicFramePr>
+              <a:graphicFrameLocks xmlns:a="http://schemas.openxmlformats.org/drawingml/2006/main" noChangeAspect="1"/>
+            </wp:cNvGraphicFramePr>
+            <a:graphic xmlns:a="http://schemas.openxmlformats.org/drawingml/2006/main">
+              <a:graphicData uri="http://schemas.openxmlformats.org/drawingml/2006/picture">
+                <pic:pic xmlns:pic="http://schemas.openxmlformats.org/drawingml/2006/picture">
+                  <pic:nvPicPr>
+                    <pic:cNvPr id="0" name="Picture 7"/>
+                    <pic:cNvPicPr>
+                      <a:picLocks noChangeAspect="1" noChangeArrowheads="1"/>
+                    </pic:cNvPicPr>
+                  </pic:nvPicPr>
+                  <pic:blipFill>
+                    <a:blip r:embed="rId17">
+                      <a:extLst>
+                        <a:ext uri="{28A0092B-C50C-407E-A947-70E740481C1C}">
+                          <a14:useLocalDpi xmlns:a14="http://schemas.microsoft.com/office/drawing/2010/main" val="0"/>
+                        </a:ext>
+                      </a:extLst>
+                    </a:blip>
+                    <a:srcRect/>
+                    <a:stretch>
+                      <a:fillRect/>
+                    </a:stretch>
+                  </pic:blipFill>
+                  <pic:spPr bwMode="auto">
+                    <a:xfrm>
+                      <a:off x="0" y="0"/>
+                      <a:ext cx="2832100" cy="2122170"/>
+                    </a:xfrm>
+                    <a:prstGeom prst="rect">
+                      <a:avLst/>
+                    </a:prstGeom>
+                    <a:noFill/>
+                    <a:ln>
+                      <a:noFill/>
+                    </a:ln>
+                  </pic:spPr>
+                </pic:pic>
+              </a:graphicData>
+            </a:graphic>
+            <wp14:sizeRelH relativeFrom="margin">
+              <wp14:pctWidth>0</wp14:pctWidth>
+            </wp14:sizeRelH>
+            <wp14:sizeRelV relativeFrom="margin">
+              <wp14:pctHeight>0</wp14:pctHeight>
+            </wp14:sizeRelV>
+          </wp:anchor>
+        </w:drawing>
+      </w:r>
+      <w:r>
+        <w:rPr>
+          <w:b/>
+          <w:bCs/>
+        </w:rPr>
+        <w:t>Convergence Graphs for</w:t>
+      </w:r>
+      <w:r>
+        <w:rPr>
+          <w:b/>
+          <w:bCs/>
+        </w:rPr>
+        <w:t xml:space="preserve"> </w:t>
+      </w:r>
+      <w:proofErr w:type="spellStart"/>
+      <w:r>
+        <w:rPr>
+          <w:b/>
+          <w:bCs/>
+        </w:rPr>
+        <w:t>BatchNorm</w:t>
+      </w:r>
+      <w:proofErr w:type="spellEnd"/>
+      <w:r>
+        <w:rPr>
+          <w:b/>
+          <w:bCs/>
+        </w:rPr>
+        <w:t>:</w:t>
+      </w:r>
+    </w:p>
+    <w:p>
+      <w:pPr>
+        <w:rPr>
+          <w:b/>
+          <w:bCs/>
+        </w:rPr>
+      </w:pPr>
+    </w:p>
+    <w:p>
+      <w:pPr>
+        <w:rPr>
+          <w:b/>
+          <w:bCs/>
+        </w:rPr>
+      </w:pPr>
+    </w:p>
+    <w:p>
+      <w:pPr>
+        <w:rPr>
+          <w:b/>
+          <w:bCs/>
+        </w:rPr>
+      </w:pPr>
+    </w:p>
+    <w:p>
+      <w:pPr>
+        <w:rPr>
+          <w:b/>
+          <w:bCs/>
+        </w:rPr>
+      </w:pPr>
+    </w:p>
+    <w:p>
+      <w:pPr>
+        <w:rPr>
+          <w:b/>
+          <w:bCs/>
+        </w:rPr>
+      </w:pPr>
+    </w:p>
+    <w:p>
+      <w:pPr>
+        <w:rPr>
+          <w:b/>
+          <w:bCs/>
+        </w:rPr>
+      </w:pPr>
+    </w:p>
+    <w:p>
+      <w:pPr>
+        <w:rPr>
+          <w:b/>
+          <w:bCs/>
+        </w:rPr>
+      </w:pPr>
+    </w:p>
+    <w:p>
+      <w:pPr>
+        <w:rPr>
+          <w:b/>
+          <w:bCs/>
+        </w:rPr>
+      </w:pPr>
+    </w:p>
+    <w:p>
+      <w:pPr>
+        <w:rPr>
+          <w:b/>
+          <w:bCs/>
+        </w:rPr>
+      </w:pPr>
+      <w:r>
+        <w:rPr>
+          <w:noProof/>
+        </w:rPr>
+        <w:lastRenderedPageBreak/>
+        <w:drawing>
+          <wp:anchor distT="0" distB="0" distL="114300" distR="114300" simplePos="0" relativeHeight="251727360" behindDoc="0" locked="0" layoutInCell="1" allowOverlap="1" wp14:anchorId="707EF2B9" wp14:editId="08AEC187">
+            <wp:simplePos x="0" y="0"/>
+            <wp:positionH relativeFrom="column">
+              <wp:posOffset>3105150</wp:posOffset>
+            </wp:positionH>
+            <wp:positionV relativeFrom="paragraph">
+              <wp:posOffset>374015</wp:posOffset>
+            </wp:positionV>
+            <wp:extent cx="2994025" cy="2244725"/>
+            <wp:effectExtent l="0" t="0" r="0" b="3175"/>
+            <wp:wrapSquare wrapText="bothSides"/>
+            <wp:docPr id="1658275637" name="Picture 10"/>
+            <wp:cNvGraphicFramePr>
+              <a:graphicFrameLocks xmlns:a="http://schemas.openxmlformats.org/drawingml/2006/main" noChangeAspect="1"/>
+            </wp:cNvGraphicFramePr>
+            <a:graphic xmlns:a="http://schemas.openxmlformats.org/drawingml/2006/main">
+              <a:graphicData uri="http://schemas.openxmlformats.org/drawingml/2006/picture">
+                <pic:pic xmlns:pic="http://schemas.openxmlformats.org/drawingml/2006/picture">
+                  <pic:nvPicPr>
+                    <pic:cNvPr id="0" name="Picture 10"/>
+                    <pic:cNvPicPr>
+                      <a:picLocks noChangeAspect="1" noChangeArrowheads="1"/>
+                    </pic:cNvPicPr>
+                  </pic:nvPicPr>
+                  <pic:blipFill>
+                    <a:blip r:embed="rId18">
+                      <a:extLst>
+                        <a:ext uri="{28A0092B-C50C-407E-A947-70E740481C1C}">
+                          <a14:useLocalDpi xmlns:a14="http://schemas.microsoft.com/office/drawing/2010/main" val="0"/>
+                        </a:ext>
+                      </a:extLst>
+                    </a:blip>
+                    <a:srcRect/>
+                    <a:stretch>
+                      <a:fillRect/>
+                    </a:stretch>
+                  </pic:blipFill>
+                  <pic:spPr bwMode="auto">
+                    <a:xfrm>
+                      <a:off x="0" y="0"/>
+                      <a:ext cx="2994025" cy="2244725"/>
+                    </a:xfrm>
+                    <a:prstGeom prst="rect">
+                      <a:avLst/>
+                    </a:prstGeom>
+                    <a:noFill/>
+                    <a:ln>
+                      <a:noFill/>
+                    </a:ln>
+                  </pic:spPr>
+                </pic:pic>
+              </a:graphicData>
+            </a:graphic>
+            <wp14:sizeRelH relativeFrom="margin">
+              <wp14:pctWidth>0</wp14:pctWidth>
+            </wp14:sizeRelH>
+            <wp14:sizeRelV relativeFrom="margin">
+              <wp14:pctHeight>0</wp14:pctHeight>
+            </wp14:sizeRelV>
+          </wp:anchor>
+        </w:drawing>
+      </w:r>
+      <w:r>
+        <w:rPr>
+          <w:b/>
+          <w:bCs/>
+          <w:noProof/>
+        </w:rPr>
+        <w:drawing>
+          <wp:anchor distT="0" distB="0" distL="114300" distR="114300" simplePos="0" relativeHeight="251716096" behindDoc="0" locked="0" layoutInCell="1" allowOverlap="1" wp14:anchorId="6E23D335" wp14:editId="284188A1">
+            <wp:simplePos x="0" y="0"/>
+            <wp:positionH relativeFrom="column">
+              <wp:posOffset>-127000</wp:posOffset>
+            </wp:positionH>
+            <wp:positionV relativeFrom="paragraph">
+              <wp:posOffset>368300</wp:posOffset>
+            </wp:positionV>
+            <wp:extent cx="3003550" cy="2251075"/>
+            <wp:effectExtent l="0" t="0" r="6350" b="0"/>
+            <wp:wrapSquare wrapText="bothSides"/>
+            <wp:docPr id="589445218" name="Picture 9"/>
+            <wp:cNvGraphicFramePr>
+              <a:graphicFrameLocks xmlns:a="http://schemas.openxmlformats.org/drawingml/2006/main" noChangeAspect="1"/>
+            </wp:cNvGraphicFramePr>
+            <a:graphic xmlns:a="http://schemas.openxmlformats.org/drawingml/2006/main">
+              <a:graphicData uri="http://schemas.openxmlformats.org/drawingml/2006/picture">
+                <pic:pic xmlns:pic="http://schemas.openxmlformats.org/drawingml/2006/picture">
+                  <pic:nvPicPr>
+                    <pic:cNvPr id="0" name="Picture 9"/>
+                    <pic:cNvPicPr>
+                      <a:picLocks noChangeAspect="1" noChangeArrowheads="1"/>
+                    </pic:cNvPicPr>
+                  </pic:nvPicPr>
+                  <pic:blipFill>
+                    <a:blip r:embed="rId19">
+                      <a:extLst>
+                        <a:ext uri="{28A0092B-C50C-407E-A947-70E740481C1C}">
+                          <a14:useLocalDpi xmlns:a14="http://schemas.microsoft.com/office/drawing/2010/main" val="0"/>
+                        </a:ext>
+                      </a:extLst>
+                    </a:blip>
+                    <a:srcRect/>
+                    <a:stretch>
+                      <a:fillRect/>
+                    </a:stretch>
+                  </pic:blipFill>
+                  <pic:spPr bwMode="auto">
+                    <a:xfrm>
+                      <a:off x="0" y="0"/>
+                      <a:ext cx="3003550" cy="2251075"/>
+                    </a:xfrm>
+                    <a:prstGeom prst="rect">
+                      <a:avLst/>
+                    </a:prstGeom>
+                    <a:noFill/>
+                    <a:ln>
+                      <a:noFill/>
+                    </a:ln>
+                  </pic:spPr>
+                </pic:pic>
+              </a:graphicData>
+            </a:graphic>
+            <wp14:sizeRelH relativeFrom="margin">
+              <wp14:pctWidth>0</wp14:pctWidth>
+            </wp14:sizeRelH>
+            <wp14:sizeRelV relativeFrom="margin">
+              <wp14:pctHeight>0</wp14:pctHeight>
+            </wp14:sizeRelV>
+          </wp:anchor>
+        </w:drawing>
+      </w:r>
+      <w:r>
+        <w:rPr>
+          <w:b/>
+          <w:bCs/>
+        </w:rPr>
+        <w:t>Convergence Graphs for</w:t>
+      </w:r>
+      <w:r>
+        <w:rPr>
+          <w:b/>
+          <w:bCs/>
+        </w:rPr>
+        <w:t xml:space="preserve"> Dropout</w:t>
+      </w:r>
+      <w:r>
+        <w:rPr>
+          <w:b/>
+          <w:bCs/>
+        </w:rPr>
+        <w:t>:</w:t>
+      </w:r>
+    </w:p>
+    <w:p/>
+    <w:p>
+      <w:pPr>
+        <w:rPr>
+          <w:b/>
+          <w:bCs/>
+        </w:rPr>
+      </w:pPr>
+      <w:r>
+        <w:rPr>
+          <w:noProof/>
+        </w:rPr>
+        <w:drawing>
+          <wp:anchor distT="0" distB="0" distL="114300" distR="114300" simplePos="0" relativeHeight="251733504" behindDoc="0" locked="0" layoutInCell="1" allowOverlap="1" wp14:anchorId="50136073" wp14:editId="38AE1406">
+            <wp:simplePos x="0" y="0"/>
+            <wp:positionH relativeFrom="column">
+              <wp:posOffset>3181350</wp:posOffset>
+            </wp:positionH>
+            <wp:positionV relativeFrom="paragraph">
+              <wp:posOffset>386080</wp:posOffset>
+            </wp:positionV>
+            <wp:extent cx="3022600" cy="2265045"/>
+            <wp:effectExtent l="0" t="0" r="6350" b="1905"/>
+            <wp:wrapSquare wrapText="bothSides"/>
+            <wp:docPr id="1174836130" name="Picture 12"/>
+            <wp:cNvGraphicFramePr>
+              <a:graphicFrameLocks xmlns:a="http://schemas.openxmlformats.org/drawingml/2006/main" noChangeAspect="1"/>
+            </wp:cNvGraphicFramePr>
+            <a:graphic xmlns:a="http://schemas.openxmlformats.org/drawingml/2006/main">
+              <a:graphicData uri="http://schemas.openxmlformats.org/drawingml/2006/picture">
+                <pic:pic xmlns:pic="http://schemas.openxmlformats.org/drawingml/2006/picture">
+                  <pic:nvPicPr>
+                    <pic:cNvPr id="0" name="Picture 12"/>
+                    <pic:cNvPicPr>
+                      <a:picLocks noChangeAspect="1" noChangeArrowheads="1"/>
+                    </pic:cNvPicPr>
+                  </pic:nvPicPr>
+                  <pic:blipFill>
+                    <a:blip r:embed="rId20">
+                      <a:extLst>
+                        <a:ext uri="{28A0092B-C50C-407E-A947-70E740481C1C}">
+                          <a14:useLocalDpi xmlns:a14="http://schemas.microsoft.com/office/drawing/2010/main" val="0"/>
+                        </a:ext>
+                      </a:extLst>
+                    </a:blip>
+                    <a:srcRect/>
+                    <a:stretch>
+                      <a:fillRect/>
+                    </a:stretch>
+                  </pic:blipFill>
+                  <pic:spPr bwMode="auto">
+                    <a:xfrm>
+                      <a:off x="0" y="0"/>
+                      <a:ext cx="3022600" cy="2265045"/>
+                    </a:xfrm>
+                    <a:prstGeom prst="rect">
+                      <a:avLst/>
+                    </a:prstGeom>
+                    <a:noFill/>
+                    <a:ln>
+                      <a:noFill/>
+                    </a:ln>
+                  </pic:spPr>
+                </pic:pic>
+              </a:graphicData>
+            </a:graphic>
+            <wp14:sizeRelH relativeFrom="margin">
+              <wp14:pctWidth>0</wp14:pctWidth>
+            </wp14:sizeRelH>
+            <wp14:sizeRelV relativeFrom="margin">
+              <wp14:pctHeight>0</wp14:pctHeight>
+            </wp14:sizeRelV>
+          </wp:anchor>
+        </w:drawing>
+      </w:r>
+      <w:r>
+        <w:rPr>
+          <w:b/>
+          <w:bCs/>
+        </w:rPr>
+        <w:t xml:space="preserve">Convergence Graphs for </w:t>
+      </w:r>
+      <w:r>
+        <w:rPr>
+          <w:b/>
+          <w:bCs/>
+        </w:rPr>
+        <w:t>Weight Decay</w:t>
+      </w:r>
+      <w:r>
+        <w:rPr>
+          <w:b/>
+          <w:bCs/>
+        </w:rPr>
+        <w:t>:</w:t>
+      </w:r>
+    </w:p>
+    <w:p>
+      <w:r>
+        <w:rPr>
+          <w:b/>
+          <w:bCs/>
+          <w:noProof/>
+        </w:rPr>
+        <w:drawing>
+          <wp:anchor distT="0" distB="0" distL="114300" distR="114300" simplePos="0" relativeHeight="251731456" behindDoc="0" locked="0" layoutInCell="1" allowOverlap="1" wp14:anchorId="230E3D2A" wp14:editId="6EA0465A">
+            <wp:simplePos x="0" y="0"/>
+            <wp:positionH relativeFrom="column">
+              <wp:posOffset>-69850</wp:posOffset>
+            </wp:positionH>
+            <wp:positionV relativeFrom="paragraph">
+              <wp:posOffset>83820</wp:posOffset>
+            </wp:positionV>
+            <wp:extent cx="2959100" cy="2217420"/>
+            <wp:effectExtent l="0" t="0" r="0" b="0"/>
+            <wp:wrapSquare wrapText="bothSides"/>
+            <wp:docPr id="1522664797" name="Picture 11"/>
+            <wp:cNvGraphicFramePr>
+              <a:graphicFrameLocks xmlns:a="http://schemas.openxmlformats.org/drawingml/2006/main" noChangeAspect="1"/>
+            </wp:cNvGraphicFramePr>
+            <a:graphic xmlns:a="http://schemas.openxmlformats.org/drawingml/2006/main">
+              <a:graphicData uri="http://schemas.openxmlformats.org/drawingml/2006/picture">
+                <pic:pic xmlns:pic="http://schemas.openxmlformats.org/drawingml/2006/picture">
+                  <pic:nvPicPr>
+                    <pic:cNvPr id="0" name="Picture 11"/>
+                    <pic:cNvPicPr>
+                      <a:picLocks noChangeAspect="1" noChangeArrowheads="1"/>
+                    </pic:cNvPicPr>
+                  </pic:nvPicPr>
+                  <pic:blipFill>
+                    <a:blip r:embed="rId21">
+                      <a:extLst>
+                        <a:ext uri="{28A0092B-C50C-407E-A947-70E740481C1C}">
+                          <a14:useLocalDpi xmlns:a14="http://schemas.microsoft.com/office/drawing/2010/main" val="0"/>
+                        </a:ext>
+                      </a:extLst>
+                    </a:blip>
+                    <a:srcRect/>
+                    <a:stretch>
+                      <a:fillRect/>
+                    </a:stretch>
+                  </pic:blipFill>
+                  <pic:spPr bwMode="auto">
+                    <a:xfrm>
+                      <a:off x="0" y="0"/>
+                      <a:ext cx="2959100" cy="2217420"/>
+                    </a:xfrm>
+                    <a:prstGeom prst="rect">
+                      <a:avLst/>
+                    </a:prstGeom>
+                    <a:noFill/>
+                    <a:ln>
+                      <a:noFill/>
+                    </a:ln>
+                  </pic:spPr>
+                </pic:pic>
+              </a:graphicData>
+            </a:graphic>
+            <wp14:sizeRelH relativeFrom="margin">
+              <wp14:pctWidth>0</wp14:pctWidth>
+            </wp14:sizeRelH>
+            <wp14:sizeRelV relativeFrom="margin">
+              <wp14:pctHeight>0</wp14:pctHeight>
+            </wp14:sizeRelV>
+          </wp:anchor>
+        </w:drawing>
+      </w:r>
+    </w:p>
     <w:sectPr>
       <w:pgSz w:w="12240" w:h="15840"/>
       <w:pgMar w:top="1440" w:right="1440" w:bottom="1440" w:left="1440" w:header="720" w:footer="720" w:gutter="0"/>
@@ -1438,6 +3875,109 @@
     </w:sectPr>
   </w:body>
 </w:document>
+</file>
+
+<file path=word/endnotes.xml><?xml version="1.0" encoding="utf-8"?>
+<w:endnotes xmlns:wpc="http://schemas.microsoft.com/office/word/2010/wordprocessingCanvas" xmlns:cx="http://schemas.microsoft.com/office/drawing/2014/chartex" xmlns:cx1="http://schemas.microsoft.com/office/drawing/2015/9/8/chartex" xmlns:cx2="http://schemas.microsoft.com/office/drawing/2015/10/21/chartex" xmlns:cx3="http://schemas.microsoft.com/office/drawing/2016/5/9/chartex" xmlns:cx4="http://schemas.microsoft.com/office/drawing/2016/5/10/chartex" xmlns:cx5="http://schemas.microsoft.com/office/drawing/2016/5/11/chartex" xmlns:cx6="http://schemas.microsoft.com/office/drawing/2016/5/12/chartex" xmlns:cx7="http://schemas.microsoft.com/office/drawing/2016/5/13/chartex" xmlns:cx8="http://schemas.microsoft.com/office/drawing/2016/5/14/chartex" xmlns:mc="http://schemas.openxmlformats.org/markup-compatibility/2006" xmlns:aink="http://schemas.microsoft.com/office/drawing/2016/ink" xmlns:am3d="http://schemas.microsoft.com/office/drawing/2017/model3d" xmlns:o="urn:schemas-microsoft-com:office:office" xmlns:oel="http://schemas.microsoft.com/office/2019/extlst" xmlns:r="http://schemas.openxmlformats.org/officeDocument/2006/relationships" xmlns:m="http://schemas.openxmlformats.org/officeDocument/2006/math" xmlns:v="urn:schemas-microsoft-com:vml" xmlns:wp14="http://schemas.microsoft.com/office/word/2010/wordprocessingDrawing" xmlns:wp="http://schemas.openxmlformats.org/drawingml/2006/wordprocessingDrawing" xmlns:w10="urn:schemas-microsoft-com:office:word" xmlns:w="http://schemas.openxmlformats.org/wordprocessingml/2006/main" xmlns:w14="http://schemas.microsoft.com/office/word/2010/wordml" xmlns:w15="http://schemas.microsoft.com/office/word/2012/wordml" xmlns:w16cex="http://schemas.microsoft.com/office/word/2018/wordml/cex" xmlns:w16cid="http://schemas.microsoft.com/office/word/2016/wordml/cid" xmlns:w16="http://schemas.microsoft.com/office/word/2018/wordml" xmlns:w16du="http://schemas.microsoft.com/office/word/2023/wordml/word16du" xmlns:w16sdtdh="http://schemas.microsoft.com/office/word/2020/wordml/sdtdatahash" xmlns:w16sdtfl="http://schemas.microsoft.com/office/word/2024/wordml/sdtformatlock" xmlns:w16se="http://schemas.microsoft.com/office/word/2015/wordml/symex" xmlns:wpg="http://schemas.microsoft.com/office/word/2010/wordprocessingGroup" xmlns:wpi="http://schemas.microsoft.com/office/word/2010/wordprocessingInk" xmlns:wne="http://schemas.microsoft.com/office/word/2006/wordml" xmlns:wps="http://schemas.microsoft.com/office/word/2010/wordprocessingShape" mc:Ignorable="w14 w15 w16se w16cid w16 w16cex w16sdtdh w16sdtfl w16du wp14">
+  <w:endnote w:type="separator" w:id="-1">
+    <w:p>
+      <w:pPr>
+        <w:spacing w:after="0" w:line="240" w:lineRule="auto"/>
+      </w:pPr>
+      <w:r>
+        <w:separator/>
+      </w:r>
+    </w:p>
+  </w:endnote>
+  <w:endnote w:type="continuationSeparator" w:id="0">
+    <w:p>
+      <w:pPr>
+        <w:spacing w:after="0" w:line="240" w:lineRule="auto"/>
+      </w:pPr>
+      <w:r>
+        <w:continuationSeparator/>
+      </w:r>
+    </w:p>
+  </w:endnote>
+</w:endnotes>
+</file>
+
+<file path=word/footnotes.xml><?xml version="1.0" encoding="utf-8"?>
+<w:footnotes xmlns:wpc="http://schemas.microsoft.com/office/word/2010/wordprocessingCanvas" xmlns:cx="http://schemas.microsoft.com/office/drawing/2014/chartex" xmlns:cx1="http://schemas.microsoft.com/office/drawing/2015/9/8/chartex" xmlns:cx2="http://schemas.microsoft.com/office/drawing/2015/10/21/chartex" xmlns:cx3="http://schemas.microsoft.com/office/drawing/2016/5/9/chartex" xmlns:cx4="http://schemas.microsoft.com/office/drawing/2016/5/10/chartex" xmlns:cx5="http://schemas.microsoft.com/office/drawing/2016/5/11/chartex" xmlns:cx6="http://schemas.microsoft.com/office/drawing/2016/5/12/chartex" xmlns:cx7="http://schemas.microsoft.com/office/drawing/2016/5/13/chartex" xmlns:cx8="http://schemas.microsoft.com/office/drawing/2016/5/14/chartex" xmlns:mc="http://schemas.openxmlformats.org/markup-compatibility/2006" xmlns:aink="http://schemas.microsoft.com/office/drawing/2016/ink" xmlns:am3d="http://schemas.microsoft.com/office/drawing/2017/model3d" xmlns:o="urn:schemas-microsoft-com:office:office" xmlns:oel="http://schemas.microsoft.com/office/2019/extlst" xmlns:r="http://schemas.openxmlformats.org/officeDocument/2006/relationships" xmlns:m="http://schemas.openxmlformats.org/officeDocument/2006/math" xmlns:v="urn:schemas-microsoft-com:vml" xmlns:wp14="http://schemas.microsoft.com/office/word/2010/wordprocessingDrawing" xmlns:wp="http://schemas.openxmlformats.org/drawingml/2006/wordprocessingDrawing" xmlns:w10="urn:schemas-microsoft-com:office:word" xmlns:w="http://schemas.openxmlformats.org/wordprocessingml/2006/main" xmlns:w14="http://schemas.microsoft.com/office/word/2010/wordml" xmlns:w15="http://schemas.microsoft.com/office/word/2012/wordml" xmlns:w16cex="http://schemas.microsoft.com/office/word/2018/wordml/cex" xmlns:w16cid="http://schemas.microsoft.com/office/word/2016/wordml/cid" xmlns:w16="http://schemas.microsoft.com/office/word/2018/wordml" xmlns:w16du="http://schemas.microsoft.com/office/word/2023/wordml/word16du" xmlns:w16sdtdh="http://schemas.microsoft.com/office/word/2020/wordml/sdtdatahash" xmlns:w16sdtfl="http://schemas.microsoft.com/office/word/2024/wordml/sdtformatlock" xmlns:w16se="http://schemas.microsoft.com/office/word/2015/wordml/symex" xmlns:wpg="http://schemas.microsoft.com/office/word/2010/wordprocessingGroup" xmlns:wpi="http://schemas.microsoft.com/office/word/2010/wordprocessingInk" xmlns:wne="http://schemas.microsoft.com/office/word/2006/wordml" xmlns:wps="http://schemas.microsoft.com/office/word/2010/wordprocessingShape" mc:Ignorable="w14 w15 w16se w16cid w16 w16cex w16sdtdh w16sdtfl w16du wp14">
+  <w:footnote w:type="separator" w:id="-1">
+    <w:p>
+      <w:pPr>
+        <w:spacing w:after="0" w:line="240" w:lineRule="auto"/>
+      </w:pPr>
+      <w:r>
+        <w:separator/>
+      </w:r>
+    </w:p>
+  </w:footnote>
+  <w:footnote w:type="continuationSeparator" w:id="0">
+    <w:p>
+      <w:pPr>
+        <w:spacing w:after="0" w:line="240" w:lineRule="auto"/>
+      </w:pPr>
+      <w:r>
+        <w:continuationSeparator/>
+      </w:r>
+    </w:p>
+  </w:footnote>
+  <w:footnote w:id="1">
+    <w:p>
+      <w:pPr>
+        <w:pStyle w:val="FootnoteText"/>
+      </w:pPr>
+      <w:r>
+        <w:rPr>
+          <w:rStyle w:val="FootnoteReference"/>
+        </w:rPr>
+        <w:footnoteRef/>
+      </w:r>
+      <w:r>
+        <w:t xml:space="preserve"> Presented </w:t>
+      </w:r>
+      <w:r>
+        <w:t xml:space="preserve">by </w:t>
+      </w:r>
+      <w:r>
+        <w:rPr>
+          <w:b/>
+          <w:bCs/>
+          <w:i/>
+          <w:iCs/>
+        </w:rPr>
+        <w:t>Yann LeCun et al. (1998):</w:t>
+      </w:r>
+      <w:r>
+        <w:rPr>
+          <w:i/>
+          <w:iCs/>
+        </w:rPr>
+        <w:t xml:space="preserve"> </w:t>
+      </w:r>
+      <w:r>
+        <w:rPr>
+          <w:b/>
+          <w:bCs/>
+          <w:i/>
+          <w:iCs/>
+        </w:rPr>
+        <w:t>“Gradient-Based Learning Applied to Document Recognition”</w:t>
+      </w:r>
+      <w:r>
+        <w:rPr>
+          <w:b/>
+          <w:bCs/>
+          <w:i/>
+          <w:iCs/>
+        </w:rPr>
+        <w:t>.</w:t>
+      </w:r>
+    </w:p>
+  </w:footnote>
+</w:footnotes>
 </file>
 
 <file path=word/numbering.xml><?xml version="1.0" encoding="utf-8"?>
@@ -1614,6 +4154,304 @@
     </w:lvl>
   </w:abstractNum>
   <w:abstractNum w:abstractNumId="9" w15:restartNumberingAfterBreak="0">
+    <w:nsid w:val="1068198C"/>
+    <w:multiLevelType w:val="multilevel"/>
+    <w:tmpl w:val="66762BD2"/>
+    <w:lvl w:ilvl="0">
+      <w:start w:val="1"/>
+      <w:numFmt w:val="bullet"/>
+      <w:lvlText w:val=""/>
+      <w:lvlJc w:val="left"/>
+      <w:pPr>
+        <w:tabs>
+          <w:tab w:val="num" w:pos="720"/>
+        </w:tabs>
+        <w:ind w:left="720" w:hanging="360"/>
+      </w:pPr>
+      <w:rPr>
+        <w:rFonts w:ascii="Symbol" w:hAnsi="Symbol" w:hint="default"/>
+        <w:sz w:val="20"/>
+      </w:rPr>
+    </w:lvl>
+    <w:lvl w:ilvl="1" w:tentative="1">
+      <w:start w:val="1"/>
+      <w:numFmt w:val="bullet"/>
+      <w:lvlText w:val="o"/>
+      <w:lvlJc w:val="left"/>
+      <w:pPr>
+        <w:tabs>
+          <w:tab w:val="num" w:pos="1440"/>
+        </w:tabs>
+        <w:ind w:left="1440" w:hanging="360"/>
+      </w:pPr>
+      <w:rPr>
+        <w:rFonts w:ascii="Courier New" w:hAnsi="Courier New" w:hint="default"/>
+        <w:sz w:val="20"/>
+      </w:rPr>
+    </w:lvl>
+    <w:lvl w:ilvl="2" w:tentative="1">
+      <w:start w:val="1"/>
+      <w:numFmt w:val="bullet"/>
+      <w:lvlText w:val=""/>
+      <w:lvlJc w:val="left"/>
+      <w:pPr>
+        <w:tabs>
+          <w:tab w:val="num" w:pos="2160"/>
+        </w:tabs>
+        <w:ind w:left="2160" w:hanging="360"/>
+      </w:pPr>
+      <w:rPr>
+        <w:rFonts w:ascii="Wingdings" w:hAnsi="Wingdings" w:hint="default"/>
+        <w:sz w:val="20"/>
+      </w:rPr>
+    </w:lvl>
+    <w:lvl w:ilvl="3" w:tentative="1">
+      <w:start w:val="1"/>
+      <w:numFmt w:val="bullet"/>
+      <w:lvlText w:val=""/>
+      <w:lvlJc w:val="left"/>
+      <w:pPr>
+        <w:tabs>
+          <w:tab w:val="num" w:pos="2880"/>
+        </w:tabs>
+        <w:ind w:left="2880" w:hanging="360"/>
+      </w:pPr>
+      <w:rPr>
+        <w:rFonts w:ascii="Wingdings" w:hAnsi="Wingdings" w:hint="default"/>
+        <w:sz w:val="20"/>
+      </w:rPr>
+    </w:lvl>
+    <w:lvl w:ilvl="4" w:tentative="1">
+      <w:start w:val="1"/>
+      <w:numFmt w:val="bullet"/>
+      <w:lvlText w:val=""/>
+      <w:lvlJc w:val="left"/>
+      <w:pPr>
+        <w:tabs>
+          <w:tab w:val="num" w:pos="3600"/>
+        </w:tabs>
+        <w:ind w:left="3600" w:hanging="360"/>
+      </w:pPr>
+      <w:rPr>
+        <w:rFonts w:ascii="Wingdings" w:hAnsi="Wingdings" w:hint="default"/>
+        <w:sz w:val="20"/>
+      </w:rPr>
+    </w:lvl>
+    <w:lvl w:ilvl="5" w:tentative="1">
+      <w:start w:val="1"/>
+      <w:numFmt w:val="bullet"/>
+      <w:lvlText w:val=""/>
+      <w:lvlJc w:val="left"/>
+      <w:pPr>
+        <w:tabs>
+          <w:tab w:val="num" w:pos="4320"/>
+        </w:tabs>
+        <w:ind w:left="4320" w:hanging="360"/>
+      </w:pPr>
+      <w:rPr>
+        <w:rFonts w:ascii="Wingdings" w:hAnsi="Wingdings" w:hint="default"/>
+        <w:sz w:val="20"/>
+      </w:rPr>
+    </w:lvl>
+    <w:lvl w:ilvl="6" w:tentative="1">
+      <w:start w:val="1"/>
+      <w:numFmt w:val="bullet"/>
+      <w:lvlText w:val=""/>
+      <w:lvlJc w:val="left"/>
+      <w:pPr>
+        <w:tabs>
+          <w:tab w:val="num" w:pos="5040"/>
+        </w:tabs>
+        <w:ind w:left="5040" w:hanging="360"/>
+      </w:pPr>
+      <w:rPr>
+        <w:rFonts w:ascii="Wingdings" w:hAnsi="Wingdings" w:hint="default"/>
+        <w:sz w:val="20"/>
+      </w:rPr>
+    </w:lvl>
+    <w:lvl w:ilvl="7" w:tentative="1">
+      <w:start w:val="1"/>
+      <w:numFmt w:val="bullet"/>
+      <w:lvlText w:val=""/>
+      <w:lvlJc w:val="left"/>
+      <w:pPr>
+        <w:tabs>
+          <w:tab w:val="num" w:pos="5760"/>
+        </w:tabs>
+        <w:ind w:left="5760" w:hanging="360"/>
+      </w:pPr>
+      <w:rPr>
+        <w:rFonts w:ascii="Wingdings" w:hAnsi="Wingdings" w:hint="default"/>
+        <w:sz w:val="20"/>
+      </w:rPr>
+    </w:lvl>
+    <w:lvl w:ilvl="8" w:tentative="1">
+      <w:start w:val="1"/>
+      <w:numFmt w:val="bullet"/>
+      <w:lvlText w:val=""/>
+      <w:lvlJc w:val="left"/>
+      <w:pPr>
+        <w:tabs>
+          <w:tab w:val="num" w:pos="6480"/>
+        </w:tabs>
+        <w:ind w:left="6480" w:hanging="360"/>
+      </w:pPr>
+      <w:rPr>
+        <w:rFonts w:ascii="Wingdings" w:hAnsi="Wingdings" w:hint="default"/>
+        <w:sz w:val="20"/>
+      </w:rPr>
+    </w:lvl>
+  </w:abstractNum>
+  <w:abstractNum w:abstractNumId="10" w15:restartNumberingAfterBreak="0">
+    <w:nsid w:val="1F095139"/>
+    <w:multiLevelType w:val="multilevel"/>
+    <w:tmpl w:val="67A4687C"/>
+    <w:lvl w:ilvl="0">
+      <w:start w:val="1"/>
+      <w:numFmt w:val="bullet"/>
+      <w:lvlText w:val=""/>
+      <w:lvlJc w:val="left"/>
+      <w:pPr>
+        <w:tabs>
+          <w:tab w:val="num" w:pos="720"/>
+        </w:tabs>
+        <w:ind w:left="720" w:hanging="360"/>
+      </w:pPr>
+      <w:rPr>
+        <w:rFonts w:ascii="Symbol" w:hAnsi="Symbol" w:hint="default"/>
+        <w:sz w:val="20"/>
+      </w:rPr>
+    </w:lvl>
+    <w:lvl w:ilvl="1" w:tentative="1">
+      <w:start w:val="1"/>
+      <w:numFmt w:val="bullet"/>
+      <w:lvlText w:val="o"/>
+      <w:lvlJc w:val="left"/>
+      <w:pPr>
+        <w:tabs>
+          <w:tab w:val="num" w:pos="1440"/>
+        </w:tabs>
+        <w:ind w:left="1440" w:hanging="360"/>
+      </w:pPr>
+      <w:rPr>
+        <w:rFonts w:ascii="Courier New" w:hAnsi="Courier New" w:hint="default"/>
+        <w:sz w:val="20"/>
+      </w:rPr>
+    </w:lvl>
+    <w:lvl w:ilvl="2" w:tentative="1">
+      <w:start w:val="1"/>
+      <w:numFmt w:val="bullet"/>
+      <w:lvlText w:val=""/>
+      <w:lvlJc w:val="left"/>
+      <w:pPr>
+        <w:tabs>
+          <w:tab w:val="num" w:pos="2160"/>
+        </w:tabs>
+        <w:ind w:left="2160" w:hanging="360"/>
+      </w:pPr>
+      <w:rPr>
+        <w:rFonts w:ascii="Wingdings" w:hAnsi="Wingdings" w:hint="default"/>
+        <w:sz w:val="20"/>
+      </w:rPr>
+    </w:lvl>
+    <w:lvl w:ilvl="3" w:tentative="1">
+      <w:start w:val="1"/>
+      <w:numFmt w:val="bullet"/>
+      <w:lvlText w:val=""/>
+      <w:lvlJc w:val="left"/>
+      <w:pPr>
+        <w:tabs>
+          <w:tab w:val="num" w:pos="2880"/>
+        </w:tabs>
+        <w:ind w:left="2880" w:hanging="360"/>
+      </w:pPr>
+      <w:rPr>
+        <w:rFonts w:ascii="Wingdings" w:hAnsi="Wingdings" w:hint="default"/>
+        <w:sz w:val="20"/>
+      </w:rPr>
+    </w:lvl>
+    <w:lvl w:ilvl="4" w:tentative="1">
+      <w:start w:val="1"/>
+      <w:numFmt w:val="bullet"/>
+      <w:lvlText w:val=""/>
+      <w:lvlJc w:val="left"/>
+      <w:pPr>
+        <w:tabs>
+          <w:tab w:val="num" w:pos="3600"/>
+        </w:tabs>
+        <w:ind w:left="3600" w:hanging="360"/>
+      </w:pPr>
+      <w:rPr>
+        <w:rFonts w:ascii="Wingdings" w:hAnsi="Wingdings" w:hint="default"/>
+        <w:sz w:val="20"/>
+      </w:rPr>
+    </w:lvl>
+    <w:lvl w:ilvl="5" w:tentative="1">
+      <w:start w:val="1"/>
+      <w:numFmt w:val="bullet"/>
+      <w:lvlText w:val=""/>
+      <w:lvlJc w:val="left"/>
+      <w:pPr>
+        <w:tabs>
+          <w:tab w:val="num" w:pos="4320"/>
+        </w:tabs>
+        <w:ind w:left="4320" w:hanging="360"/>
+      </w:pPr>
+      <w:rPr>
+        <w:rFonts w:ascii="Wingdings" w:hAnsi="Wingdings" w:hint="default"/>
+        <w:sz w:val="20"/>
+      </w:rPr>
+    </w:lvl>
+    <w:lvl w:ilvl="6" w:tentative="1">
+      <w:start w:val="1"/>
+      <w:numFmt w:val="bullet"/>
+      <w:lvlText w:val=""/>
+      <w:lvlJc w:val="left"/>
+      <w:pPr>
+        <w:tabs>
+          <w:tab w:val="num" w:pos="5040"/>
+        </w:tabs>
+        <w:ind w:left="5040" w:hanging="360"/>
+      </w:pPr>
+      <w:rPr>
+        <w:rFonts w:ascii="Wingdings" w:hAnsi="Wingdings" w:hint="default"/>
+        <w:sz w:val="20"/>
+      </w:rPr>
+    </w:lvl>
+    <w:lvl w:ilvl="7" w:tentative="1">
+      <w:start w:val="1"/>
+      <w:numFmt w:val="bullet"/>
+      <w:lvlText w:val=""/>
+      <w:lvlJc w:val="left"/>
+      <w:pPr>
+        <w:tabs>
+          <w:tab w:val="num" w:pos="5760"/>
+        </w:tabs>
+        <w:ind w:left="5760" w:hanging="360"/>
+      </w:pPr>
+      <w:rPr>
+        <w:rFonts w:ascii="Wingdings" w:hAnsi="Wingdings" w:hint="default"/>
+        <w:sz w:val="20"/>
+      </w:rPr>
+    </w:lvl>
+    <w:lvl w:ilvl="8" w:tentative="1">
+      <w:start w:val="1"/>
+      <w:numFmt w:val="bullet"/>
+      <w:lvlText w:val=""/>
+      <w:lvlJc w:val="left"/>
+      <w:pPr>
+        <w:tabs>
+          <w:tab w:val="num" w:pos="6480"/>
+        </w:tabs>
+        <w:ind w:left="6480" w:hanging="360"/>
+      </w:pPr>
+      <w:rPr>
+        <w:rFonts w:ascii="Wingdings" w:hAnsi="Wingdings" w:hint="default"/>
+        <w:sz w:val="20"/>
+      </w:rPr>
+    </w:lvl>
+  </w:abstractNum>
+  <w:abstractNum w:abstractNumId="11" w15:restartNumberingAfterBreak="0">
     <w:nsid w:val="21C235AE"/>
     <w:multiLevelType w:val="hybridMultilevel"/>
     <w:tmpl w:val="FFFFFFFF"/>
@@ -1699,7 +4537,7 @@
       </w:pPr>
     </w:lvl>
   </w:abstractNum>
-  <w:abstractNum w:abstractNumId="10" w15:restartNumberingAfterBreak="0">
+  <w:abstractNum w:abstractNumId="12" w15:restartNumberingAfterBreak="0">
     <w:nsid w:val="245638E8"/>
     <w:multiLevelType w:val="hybridMultilevel"/>
     <w:tmpl w:val="FFFFFFFF"/>
@@ -1812,7 +4650,156 @@
       </w:rPr>
     </w:lvl>
   </w:abstractNum>
-  <w:abstractNum w:abstractNumId="11" w15:restartNumberingAfterBreak="0">
+  <w:abstractNum w:abstractNumId="13" w15:restartNumberingAfterBreak="0">
+    <w:nsid w:val="24C85855"/>
+    <w:multiLevelType w:val="multilevel"/>
+    <w:tmpl w:val="0BD2C024"/>
+    <w:lvl w:ilvl="0">
+      <w:start w:val="1"/>
+      <w:numFmt w:val="bullet"/>
+      <w:lvlText w:val=""/>
+      <w:lvlJc w:val="left"/>
+      <w:pPr>
+        <w:tabs>
+          <w:tab w:val="num" w:pos="720"/>
+        </w:tabs>
+        <w:ind w:left="720" w:hanging="360"/>
+      </w:pPr>
+      <w:rPr>
+        <w:rFonts w:ascii="Symbol" w:hAnsi="Symbol" w:hint="default"/>
+        <w:sz w:val="20"/>
+      </w:rPr>
+    </w:lvl>
+    <w:lvl w:ilvl="1" w:tentative="1">
+      <w:start w:val="1"/>
+      <w:numFmt w:val="bullet"/>
+      <w:lvlText w:val="o"/>
+      <w:lvlJc w:val="left"/>
+      <w:pPr>
+        <w:tabs>
+          <w:tab w:val="num" w:pos="1440"/>
+        </w:tabs>
+        <w:ind w:left="1440" w:hanging="360"/>
+      </w:pPr>
+      <w:rPr>
+        <w:rFonts w:ascii="Courier New" w:hAnsi="Courier New" w:hint="default"/>
+        <w:sz w:val="20"/>
+      </w:rPr>
+    </w:lvl>
+    <w:lvl w:ilvl="2" w:tentative="1">
+      <w:start w:val="1"/>
+      <w:numFmt w:val="bullet"/>
+      <w:lvlText w:val=""/>
+      <w:lvlJc w:val="left"/>
+      <w:pPr>
+        <w:tabs>
+          <w:tab w:val="num" w:pos="2160"/>
+        </w:tabs>
+        <w:ind w:left="2160" w:hanging="360"/>
+      </w:pPr>
+      <w:rPr>
+        <w:rFonts w:ascii="Wingdings" w:hAnsi="Wingdings" w:hint="default"/>
+        <w:sz w:val="20"/>
+      </w:rPr>
+    </w:lvl>
+    <w:lvl w:ilvl="3" w:tentative="1">
+      <w:start w:val="1"/>
+      <w:numFmt w:val="bullet"/>
+      <w:lvlText w:val=""/>
+      <w:lvlJc w:val="left"/>
+      <w:pPr>
+        <w:tabs>
+          <w:tab w:val="num" w:pos="2880"/>
+        </w:tabs>
+        <w:ind w:left="2880" w:hanging="360"/>
+      </w:pPr>
+      <w:rPr>
+        <w:rFonts w:ascii="Wingdings" w:hAnsi="Wingdings" w:hint="default"/>
+        <w:sz w:val="20"/>
+      </w:rPr>
+    </w:lvl>
+    <w:lvl w:ilvl="4" w:tentative="1">
+      <w:start w:val="1"/>
+      <w:numFmt w:val="bullet"/>
+      <w:lvlText w:val=""/>
+      <w:lvlJc w:val="left"/>
+      <w:pPr>
+        <w:tabs>
+          <w:tab w:val="num" w:pos="3600"/>
+        </w:tabs>
+        <w:ind w:left="3600" w:hanging="360"/>
+      </w:pPr>
+      <w:rPr>
+        <w:rFonts w:ascii="Wingdings" w:hAnsi="Wingdings" w:hint="default"/>
+        <w:sz w:val="20"/>
+      </w:rPr>
+    </w:lvl>
+    <w:lvl w:ilvl="5" w:tentative="1">
+      <w:start w:val="1"/>
+      <w:numFmt w:val="bullet"/>
+      <w:lvlText w:val=""/>
+      <w:lvlJc w:val="left"/>
+      <w:pPr>
+        <w:tabs>
+          <w:tab w:val="num" w:pos="4320"/>
+        </w:tabs>
+        <w:ind w:left="4320" w:hanging="360"/>
+      </w:pPr>
+      <w:rPr>
+        <w:rFonts w:ascii="Wingdings" w:hAnsi="Wingdings" w:hint="default"/>
+        <w:sz w:val="20"/>
+      </w:rPr>
+    </w:lvl>
+    <w:lvl w:ilvl="6" w:tentative="1">
+      <w:start w:val="1"/>
+      <w:numFmt w:val="bullet"/>
+      <w:lvlText w:val=""/>
+      <w:lvlJc w:val="left"/>
+      <w:pPr>
+        <w:tabs>
+          <w:tab w:val="num" w:pos="5040"/>
+        </w:tabs>
+        <w:ind w:left="5040" w:hanging="360"/>
+      </w:pPr>
+      <w:rPr>
+        <w:rFonts w:ascii="Wingdings" w:hAnsi="Wingdings" w:hint="default"/>
+        <w:sz w:val="20"/>
+      </w:rPr>
+    </w:lvl>
+    <w:lvl w:ilvl="7" w:tentative="1">
+      <w:start w:val="1"/>
+      <w:numFmt w:val="bullet"/>
+      <w:lvlText w:val=""/>
+      <w:lvlJc w:val="left"/>
+      <w:pPr>
+        <w:tabs>
+          <w:tab w:val="num" w:pos="5760"/>
+        </w:tabs>
+        <w:ind w:left="5760" w:hanging="360"/>
+      </w:pPr>
+      <w:rPr>
+        <w:rFonts w:ascii="Wingdings" w:hAnsi="Wingdings" w:hint="default"/>
+        <w:sz w:val="20"/>
+      </w:rPr>
+    </w:lvl>
+    <w:lvl w:ilvl="8" w:tentative="1">
+      <w:start w:val="1"/>
+      <w:numFmt w:val="bullet"/>
+      <w:lvlText w:val=""/>
+      <w:lvlJc w:val="left"/>
+      <w:pPr>
+        <w:tabs>
+          <w:tab w:val="num" w:pos="6480"/>
+        </w:tabs>
+        <w:ind w:left="6480" w:hanging="360"/>
+      </w:pPr>
+      <w:rPr>
+        <w:rFonts w:ascii="Wingdings" w:hAnsi="Wingdings" w:hint="default"/>
+        <w:sz w:val="20"/>
+      </w:rPr>
+    </w:lvl>
+  </w:abstractNum>
+  <w:abstractNum w:abstractNumId="14" w15:restartNumberingAfterBreak="0">
     <w:nsid w:val="25D9212E"/>
     <w:multiLevelType w:val="hybridMultilevel"/>
     <w:tmpl w:val="FFFFFFFF"/>
@@ -1925,7 +4912,156 @@
       </w:rPr>
     </w:lvl>
   </w:abstractNum>
-  <w:abstractNum w:abstractNumId="12" w15:restartNumberingAfterBreak="0">
+  <w:abstractNum w:abstractNumId="15" w15:restartNumberingAfterBreak="0">
+    <w:nsid w:val="2D764088"/>
+    <w:multiLevelType w:val="multilevel"/>
+    <w:tmpl w:val="BCDE351E"/>
+    <w:lvl w:ilvl="0">
+      <w:start w:val="1"/>
+      <w:numFmt w:val="bullet"/>
+      <w:lvlText w:val=""/>
+      <w:lvlJc w:val="left"/>
+      <w:pPr>
+        <w:tabs>
+          <w:tab w:val="num" w:pos="720"/>
+        </w:tabs>
+        <w:ind w:left="720" w:hanging="360"/>
+      </w:pPr>
+      <w:rPr>
+        <w:rFonts w:ascii="Symbol" w:hAnsi="Symbol" w:hint="default"/>
+        <w:sz w:val="20"/>
+      </w:rPr>
+    </w:lvl>
+    <w:lvl w:ilvl="1" w:tentative="1">
+      <w:start w:val="1"/>
+      <w:numFmt w:val="bullet"/>
+      <w:lvlText w:val="o"/>
+      <w:lvlJc w:val="left"/>
+      <w:pPr>
+        <w:tabs>
+          <w:tab w:val="num" w:pos="1440"/>
+        </w:tabs>
+        <w:ind w:left="1440" w:hanging="360"/>
+      </w:pPr>
+      <w:rPr>
+        <w:rFonts w:ascii="Courier New" w:hAnsi="Courier New" w:hint="default"/>
+        <w:sz w:val="20"/>
+      </w:rPr>
+    </w:lvl>
+    <w:lvl w:ilvl="2" w:tentative="1">
+      <w:start w:val="1"/>
+      <w:numFmt w:val="bullet"/>
+      <w:lvlText w:val=""/>
+      <w:lvlJc w:val="left"/>
+      <w:pPr>
+        <w:tabs>
+          <w:tab w:val="num" w:pos="2160"/>
+        </w:tabs>
+        <w:ind w:left="2160" w:hanging="360"/>
+      </w:pPr>
+      <w:rPr>
+        <w:rFonts w:ascii="Wingdings" w:hAnsi="Wingdings" w:hint="default"/>
+        <w:sz w:val="20"/>
+      </w:rPr>
+    </w:lvl>
+    <w:lvl w:ilvl="3" w:tentative="1">
+      <w:start w:val="1"/>
+      <w:numFmt w:val="bullet"/>
+      <w:lvlText w:val=""/>
+      <w:lvlJc w:val="left"/>
+      <w:pPr>
+        <w:tabs>
+          <w:tab w:val="num" w:pos="2880"/>
+        </w:tabs>
+        <w:ind w:left="2880" w:hanging="360"/>
+      </w:pPr>
+      <w:rPr>
+        <w:rFonts w:ascii="Wingdings" w:hAnsi="Wingdings" w:hint="default"/>
+        <w:sz w:val="20"/>
+      </w:rPr>
+    </w:lvl>
+    <w:lvl w:ilvl="4" w:tentative="1">
+      <w:start w:val="1"/>
+      <w:numFmt w:val="bullet"/>
+      <w:lvlText w:val=""/>
+      <w:lvlJc w:val="left"/>
+      <w:pPr>
+        <w:tabs>
+          <w:tab w:val="num" w:pos="3600"/>
+        </w:tabs>
+        <w:ind w:left="3600" w:hanging="360"/>
+      </w:pPr>
+      <w:rPr>
+        <w:rFonts w:ascii="Wingdings" w:hAnsi="Wingdings" w:hint="default"/>
+        <w:sz w:val="20"/>
+      </w:rPr>
+    </w:lvl>
+    <w:lvl w:ilvl="5" w:tentative="1">
+      <w:start w:val="1"/>
+      <w:numFmt w:val="bullet"/>
+      <w:lvlText w:val=""/>
+      <w:lvlJc w:val="left"/>
+      <w:pPr>
+        <w:tabs>
+          <w:tab w:val="num" w:pos="4320"/>
+        </w:tabs>
+        <w:ind w:left="4320" w:hanging="360"/>
+      </w:pPr>
+      <w:rPr>
+        <w:rFonts w:ascii="Wingdings" w:hAnsi="Wingdings" w:hint="default"/>
+        <w:sz w:val="20"/>
+      </w:rPr>
+    </w:lvl>
+    <w:lvl w:ilvl="6" w:tentative="1">
+      <w:start w:val="1"/>
+      <w:numFmt w:val="bullet"/>
+      <w:lvlText w:val=""/>
+      <w:lvlJc w:val="left"/>
+      <w:pPr>
+        <w:tabs>
+          <w:tab w:val="num" w:pos="5040"/>
+        </w:tabs>
+        <w:ind w:left="5040" w:hanging="360"/>
+      </w:pPr>
+      <w:rPr>
+        <w:rFonts w:ascii="Wingdings" w:hAnsi="Wingdings" w:hint="default"/>
+        <w:sz w:val="20"/>
+      </w:rPr>
+    </w:lvl>
+    <w:lvl w:ilvl="7" w:tentative="1">
+      <w:start w:val="1"/>
+      <w:numFmt w:val="bullet"/>
+      <w:lvlText w:val=""/>
+      <w:lvlJc w:val="left"/>
+      <w:pPr>
+        <w:tabs>
+          <w:tab w:val="num" w:pos="5760"/>
+        </w:tabs>
+        <w:ind w:left="5760" w:hanging="360"/>
+      </w:pPr>
+      <w:rPr>
+        <w:rFonts w:ascii="Wingdings" w:hAnsi="Wingdings" w:hint="default"/>
+        <w:sz w:val="20"/>
+      </w:rPr>
+    </w:lvl>
+    <w:lvl w:ilvl="8" w:tentative="1">
+      <w:start w:val="1"/>
+      <w:numFmt w:val="bullet"/>
+      <w:lvlText w:val=""/>
+      <w:lvlJc w:val="left"/>
+      <w:pPr>
+        <w:tabs>
+          <w:tab w:val="num" w:pos="6480"/>
+        </w:tabs>
+        <w:ind w:left="6480" w:hanging="360"/>
+      </w:pPr>
+      <w:rPr>
+        <w:rFonts w:ascii="Wingdings" w:hAnsi="Wingdings" w:hint="default"/>
+        <w:sz w:val="20"/>
+      </w:rPr>
+    </w:lvl>
+  </w:abstractNum>
+  <w:abstractNum w:abstractNumId="16" w15:restartNumberingAfterBreak="0">
     <w:nsid w:val="3B28725A"/>
     <w:multiLevelType w:val="hybridMultilevel"/>
     <w:tmpl w:val="FFFFFFFF"/>
@@ -2011,7 +5147,7 @@
       </w:pPr>
     </w:lvl>
   </w:abstractNum>
-  <w:abstractNum w:abstractNumId="13" w15:restartNumberingAfterBreak="0">
+  <w:abstractNum w:abstractNumId="17" w15:restartNumberingAfterBreak="0">
     <w:nsid w:val="3EBCABA0"/>
     <w:multiLevelType w:val="hybridMultilevel"/>
     <w:tmpl w:val="FFFFFFFF"/>
@@ -2097,7 +5233,7 @@
       </w:pPr>
     </w:lvl>
   </w:abstractNum>
-  <w:abstractNum w:abstractNumId="14" w15:restartNumberingAfterBreak="0">
+  <w:abstractNum w:abstractNumId="18" w15:restartNumberingAfterBreak="0">
     <w:nsid w:val="4353FA52"/>
     <w:multiLevelType w:val="hybridMultilevel"/>
     <w:tmpl w:val="FFFFFFFF"/>
@@ -2183,7 +5319,382 @@
       </w:pPr>
     </w:lvl>
   </w:abstractNum>
-  <w:abstractNum w:abstractNumId="15" w15:restartNumberingAfterBreak="0">
+  <w:abstractNum w:abstractNumId="19" w15:restartNumberingAfterBreak="0">
+    <w:nsid w:val="491455F9"/>
+    <w:multiLevelType w:val="hybridMultilevel"/>
+    <w:tmpl w:val="F540310C"/>
+    <w:lvl w:ilvl="0" w:tplc="04090001">
+      <w:start w:val="1"/>
+      <w:numFmt w:val="bullet"/>
+      <w:lvlText w:val=""/>
+      <w:lvlJc w:val="left"/>
+      <w:pPr>
+        <w:ind w:left="720" w:hanging="360"/>
+      </w:pPr>
+      <w:rPr>
+        <w:rFonts w:ascii="Symbol" w:hAnsi="Symbol" w:hint="default"/>
+      </w:rPr>
+    </w:lvl>
+    <w:lvl w:ilvl="1" w:tplc="04090003">
+      <w:start w:val="1"/>
+      <w:numFmt w:val="bullet"/>
+      <w:lvlText w:val="o"/>
+      <w:lvlJc w:val="left"/>
+      <w:pPr>
+        <w:ind w:left="1440" w:hanging="360"/>
+      </w:pPr>
+      <w:rPr>
+        <w:rFonts w:ascii="Courier New" w:hAnsi="Courier New" w:cs="Courier New" w:hint="default"/>
+      </w:rPr>
+    </w:lvl>
+    <w:lvl w:ilvl="2" w:tplc="04090005" w:tentative="1">
+      <w:start w:val="1"/>
+      <w:numFmt w:val="bullet"/>
+      <w:lvlText w:val=""/>
+      <w:lvlJc w:val="left"/>
+      <w:pPr>
+        <w:ind w:left="2160" w:hanging="360"/>
+      </w:pPr>
+      <w:rPr>
+        <w:rFonts w:ascii="Wingdings" w:hAnsi="Wingdings" w:hint="default"/>
+      </w:rPr>
+    </w:lvl>
+    <w:lvl w:ilvl="3" w:tplc="04090001" w:tentative="1">
+      <w:start w:val="1"/>
+      <w:numFmt w:val="bullet"/>
+      <w:lvlText w:val=""/>
+      <w:lvlJc w:val="left"/>
+      <w:pPr>
+        <w:ind w:left="2880" w:hanging="360"/>
+      </w:pPr>
+      <w:rPr>
+        <w:rFonts w:ascii="Symbol" w:hAnsi="Symbol" w:hint="default"/>
+      </w:rPr>
+    </w:lvl>
+    <w:lvl w:ilvl="4" w:tplc="04090003" w:tentative="1">
+      <w:start w:val="1"/>
+      <w:numFmt w:val="bullet"/>
+      <w:lvlText w:val="o"/>
+      <w:lvlJc w:val="left"/>
+      <w:pPr>
+        <w:ind w:left="3600" w:hanging="360"/>
+      </w:pPr>
+      <w:rPr>
+        <w:rFonts w:ascii="Courier New" w:hAnsi="Courier New" w:cs="Courier New" w:hint="default"/>
+      </w:rPr>
+    </w:lvl>
+    <w:lvl w:ilvl="5" w:tplc="04090005" w:tentative="1">
+      <w:start w:val="1"/>
+      <w:numFmt w:val="bullet"/>
+      <w:lvlText w:val=""/>
+      <w:lvlJc w:val="left"/>
+      <w:pPr>
+        <w:ind w:left="4320" w:hanging="360"/>
+      </w:pPr>
+      <w:rPr>
+        <w:rFonts w:ascii="Wingdings" w:hAnsi="Wingdings" w:hint="default"/>
+      </w:rPr>
+    </w:lvl>
+    <w:lvl w:ilvl="6" w:tplc="04090001" w:tentative="1">
+      <w:start w:val="1"/>
+      <w:numFmt w:val="bullet"/>
+      <w:lvlText w:val=""/>
+      <w:lvlJc w:val="left"/>
+      <w:pPr>
+        <w:ind w:left="5040" w:hanging="360"/>
+      </w:pPr>
+      <w:rPr>
+        <w:rFonts w:ascii="Symbol" w:hAnsi="Symbol" w:hint="default"/>
+      </w:rPr>
+    </w:lvl>
+    <w:lvl w:ilvl="7" w:tplc="04090003" w:tentative="1">
+      <w:start w:val="1"/>
+      <w:numFmt w:val="bullet"/>
+      <w:lvlText w:val="o"/>
+      <w:lvlJc w:val="left"/>
+      <w:pPr>
+        <w:ind w:left="5760" w:hanging="360"/>
+      </w:pPr>
+      <w:rPr>
+        <w:rFonts w:ascii="Courier New" w:hAnsi="Courier New" w:cs="Courier New" w:hint="default"/>
+      </w:rPr>
+    </w:lvl>
+    <w:lvl w:ilvl="8" w:tplc="04090005" w:tentative="1">
+      <w:start w:val="1"/>
+      <w:numFmt w:val="bullet"/>
+      <w:lvlText w:val=""/>
+      <w:lvlJc w:val="left"/>
+      <w:pPr>
+        <w:ind w:left="6480" w:hanging="360"/>
+      </w:pPr>
+      <w:rPr>
+        <w:rFonts w:ascii="Wingdings" w:hAnsi="Wingdings" w:hint="default"/>
+      </w:rPr>
+    </w:lvl>
+  </w:abstractNum>
+  <w:abstractNum w:abstractNumId="20" w15:restartNumberingAfterBreak="0">
+    <w:nsid w:val="53D14F81"/>
+    <w:multiLevelType w:val="multilevel"/>
+    <w:tmpl w:val="A2E80A30"/>
+    <w:lvl w:ilvl="0">
+      <w:start w:val="1"/>
+      <w:numFmt w:val="decimal"/>
+      <w:lvlText w:val="%1."/>
+      <w:lvlJc w:val="left"/>
+      <w:pPr>
+        <w:tabs>
+          <w:tab w:val="num" w:pos="720"/>
+        </w:tabs>
+        <w:ind w:left="720" w:hanging="360"/>
+      </w:pPr>
+    </w:lvl>
+    <w:lvl w:ilvl="1" w:tentative="1">
+      <w:start w:val="1"/>
+      <w:numFmt w:val="decimal"/>
+      <w:lvlText w:val="%2."/>
+      <w:lvlJc w:val="left"/>
+      <w:pPr>
+        <w:tabs>
+          <w:tab w:val="num" w:pos="1440"/>
+        </w:tabs>
+        <w:ind w:left="1440" w:hanging="360"/>
+      </w:pPr>
+    </w:lvl>
+    <w:lvl w:ilvl="2" w:tentative="1">
+      <w:start w:val="1"/>
+      <w:numFmt w:val="decimal"/>
+      <w:lvlText w:val="%3."/>
+      <w:lvlJc w:val="left"/>
+      <w:pPr>
+        <w:tabs>
+          <w:tab w:val="num" w:pos="2160"/>
+        </w:tabs>
+        <w:ind w:left="2160" w:hanging="360"/>
+      </w:pPr>
+    </w:lvl>
+    <w:lvl w:ilvl="3" w:tentative="1">
+      <w:start w:val="1"/>
+      <w:numFmt w:val="decimal"/>
+      <w:lvlText w:val="%4."/>
+      <w:lvlJc w:val="left"/>
+      <w:pPr>
+        <w:tabs>
+          <w:tab w:val="num" w:pos="2880"/>
+        </w:tabs>
+        <w:ind w:left="2880" w:hanging="360"/>
+      </w:pPr>
+    </w:lvl>
+    <w:lvl w:ilvl="4" w:tentative="1">
+      <w:start w:val="1"/>
+      <w:numFmt w:val="decimal"/>
+      <w:lvlText w:val="%5."/>
+      <w:lvlJc w:val="left"/>
+      <w:pPr>
+        <w:tabs>
+          <w:tab w:val="num" w:pos="3600"/>
+        </w:tabs>
+        <w:ind w:left="3600" w:hanging="360"/>
+      </w:pPr>
+    </w:lvl>
+    <w:lvl w:ilvl="5" w:tentative="1">
+      <w:start w:val="1"/>
+      <w:numFmt w:val="decimal"/>
+      <w:lvlText w:val="%6."/>
+      <w:lvlJc w:val="left"/>
+      <w:pPr>
+        <w:tabs>
+          <w:tab w:val="num" w:pos="4320"/>
+        </w:tabs>
+        <w:ind w:left="4320" w:hanging="360"/>
+      </w:pPr>
+    </w:lvl>
+    <w:lvl w:ilvl="6" w:tentative="1">
+      <w:start w:val="1"/>
+      <w:numFmt w:val="decimal"/>
+      <w:lvlText w:val="%7."/>
+      <w:lvlJc w:val="left"/>
+      <w:pPr>
+        <w:tabs>
+          <w:tab w:val="num" w:pos="5040"/>
+        </w:tabs>
+        <w:ind w:left="5040" w:hanging="360"/>
+      </w:pPr>
+    </w:lvl>
+    <w:lvl w:ilvl="7" w:tentative="1">
+      <w:start w:val="1"/>
+      <w:numFmt w:val="decimal"/>
+      <w:lvlText w:val="%8."/>
+      <w:lvlJc w:val="left"/>
+      <w:pPr>
+        <w:tabs>
+          <w:tab w:val="num" w:pos="5760"/>
+        </w:tabs>
+        <w:ind w:left="5760" w:hanging="360"/>
+      </w:pPr>
+    </w:lvl>
+    <w:lvl w:ilvl="8" w:tentative="1">
+      <w:start w:val="1"/>
+      <w:numFmt w:val="decimal"/>
+      <w:lvlText w:val="%9."/>
+      <w:lvlJc w:val="left"/>
+      <w:pPr>
+        <w:tabs>
+          <w:tab w:val="num" w:pos="6480"/>
+        </w:tabs>
+        <w:ind w:left="6480" w:hanging="360"/>
+      </w:pPr>
+    </w:lvl>
+  </w:abstractNum>
+  <w:abstractNum w:abstractNumId="21" w15:restartNumberingAfterBreak="0">
+    <w:nsid w:val="643A4838"/>
+    <w:multiLevelType w:val="multilevel"/>
+    <w:tmpl w:val="89609D7E"/>
+    <w:lvl w:ilvl="0">
+      <w:start w:val="1"/>
+      <w:numFmt w:val="bullet"/>
+      <w:lvlText w:val=""/>
+      <w:lvlJc w:val="left"/>
+      <w:pPr>
+        <w:tabs>
+          <w:tab w:val="num" w:pos="720"/>
+        </w:tabs>
+        <w:ind w:left="720" w:hanging="360"/>
+      </w:pPr>
+      <w:rPr>
+        <w:rFonts w:ascii="Symbol" w:hAnsi="Symbol" w:hint="default"/>
+        <w:sz w:val="20"/>
+      </w:rPr>
+    </w:lvl>
+    <w:lvl w:ilvl="1" w:tentative="1">
+      <w:start w:val="1"/>
+      <w:numFmt w:val="bullet"/>
+      <w:lvlText w:val="o"/>
+      <w:lvlJc w:val="left"/>
+      <w:pPr>
+        <w:tabs>
+          <w:tab w:val="num" w:pos="1440"/>
+        </w:tabs>
+        <w:ind w:left="1440" w:hanging="360"/>
+      </w:pPr>
+      <w:rPr>
+        <w:rFonts w:ascii="Courier New" w:hAnsi="Courier New" w:hint="default"/>
+        <w:sz w:val="20"/>
+      </w:rPr>
+    </w:lvl>
+    <w:lvl w:ilvl="2" w:tentative="1">
+      <w:start w:val="1"/>
+      <w:numFmt w:val="bullet"/>
+      <w:lvlText w:val=""/>
+      <w:lvlJc w:val="left"/>
+      <w:pPr>
+        <w:tabs>
+          <w:tab w:val="num" w:pos="2160"/>
+        </w:tabs>
+        <w:ind w:left="2160" w:hanging="360"/>
+      </w:pPr>
+      <w:rPr>
+        <w:rFonts w:ascii="Wingdings" w:hAnsi="Wingdings" w:hint="default"/>
+        <w:sz w:val="20"/>
+      </w:rPr>
+    </w:lvl>
+    <w:lvl w:ilvl="3" w:tentative="1">
+      <w:start w:val="1"/>
+      <w:numFmt w:val="bullet"/>
+      <w:lvlText w:val=""/>
+      <w:lvlJc w:val="left"/>
+      <w:pPr>
+        <w:tabs>
+          <w:tab w:val="num" w:pos="2880"/>
+        </w:tabs>
+        <w:ind w:left="2880" w:hanging="360"/>
+      </w:pPr>
+      <w:rPr>
+        <w:rFonts w:ascii="Wingdings" w:hAnsi="Wingdings" w:hint="default"/>
+        <w:sz w:val="20"/>
+      </w:rPr>
+    </w:lvl>
+    <w:lvl w:ilvl="4" w:tentative="1">
+      <w:start w:val="1"/>
+      <w:numFmt w:val="bullet"/>
+      <w:lvlText w:val=""/>
+      <w:lvlJc w:val="left"/>
+      <w:pPr>
+        <w:tabs>
+          <w:tab w:val="num" w:pos="3600"/>
+        </w:tabs>
+        <w:ind w:left="3600" w:hanging="360"/>
+      </w:pPr>
+      <w:rPr>
+        <w:rFonts w:ascii="Wingdings" w:hAnsi="Wingdings" w:hint="default"/>
+        <w:sz w:val="20"/>
+      </w:rPr>
+    </w:lvl>
+    <w:lvl w:ilvl="5" w:tentative="1">
+      <w:start w:val="1"/>
+      <w:numFmt w:val="bullet"/>
+      <w:lvlText w:val=""/>
+      <w:lvlJc w:val="left"/>
+      <w:pPr>
+        <w:tabs>
+          <w:tab w:val="num" w:pos="4320"/>
+        </w:tabs>
+        <w:ind w:left="4320" w:hanging="360"/>
+      </w:pPr>
+      <w:rPr>
+        <w:rFonts w:ascii="Wingdings" w:hAnsi="Wingdings" w:hint="default"/>
+        <w:sz w:val="20"/>
+      </w:rPr>
+    </w:lvl>
+    <w:lvl w:ilvl="6" w:tentative="1">
+      <w:start w:val="1"/>
+      <w:numFmt w:val="bullet"/>
+      <w:lvlText w:val=""/>
+      <w:lvlJc w:val="left"/>
+      <w:pPr>
+        <w:tabs>
+          <w:tab w:val="num" w:pos="5040"/>
+        </w:tabs>
+        <w:ind w:left="5040" w:hanging="360"/>
+      </w:pPr>
+      <w:rPr>
+        <w:rFonts w:ascii="Wingdings" w:hAnsi="Wingdings" w:hint="default"/>
+        <w:sz w:val="20"/>
+      </w:rPr>
+    </w:lvl>
+    <w:lvl w:ilvl="7" w:tentative="1">
+      <w:start w:val="1"/>
+      <w:numFmt w:val="bullet"/>
+      <w:lvlText w:val=""/>
+      <w:lvlJc w:val="left"/>
+      <w:pPr>
+        <w:tabs>
+          <w:tab w:val="num" w:pos="5760"/>
+        </w:tabs>
+        <w:ind w:left="5760" w:hanging="360"/>
+      </w:pPr>
+      <w:rPr>
+        <w:rFonts w:ascii="Wingdings" w:hAnsi="Wingdings" w:hint="default"/>
+        <w:sz w:val="20"/>
+      </w:rPr>
+    </w:lvl>
+    <w:lvl w:ilvl="8" w:tentative="1">
+      <w:start w:val="1"/>
+      <w:numFmt w:val="bullet"/>
+      <w:lvlText w:val=""/>
+      <w:lvlJc w:val="left"/>
+      <w:pPr>
+        <w:tabs>
+          <w:tab w:val="num" w:pos="6480"/>
+        </w:tabs>
+        <w:ind w:left="6480" w:hanging="360"/>
+      </w:pPr>
+      <w:rPr>
+        <w:rFonts w:ascii="Wingdings" w:hAnsi="Wingdings" w:hint="default"/>
+        <w:sz w:val="20"/>
+      </w:rPr>
+    </w:lvl>
+  </w:abstractNum>
+  <w:abstractNum w:abstractNumId="22" w15:restartNumberingAfterBreak="0">
     <w:nsid w:val="6462BD04"/>
     <w:multiLevelType w:val="hybridMultilevel"/>
     <w:tmpl w:val="FFFFFFFF"/>
@@ -2296,7 +5807,156 @@
       </w:rPr>
     </w:lvl>
   </w:abstractNum>
-  <w:abstractNum w:abstractNumId="16" w15:restartNumberingAfterBreak="0">
+  <w:abstractNum w:abstractNumId="23" w15:restartNumberingAfterBreak="0">
+    <w:nsid w:val="65CF770D"/>
+    <w:multiLevelType w:val="multilevel"/>
+    <w:tmpl w:val="DBEA517C"/>
+    <w:lvl w:ilvl="0">
+      <w:start w:val="1"/>
+      <w:numFmt w:val="bullet"/>
+      <w:lvlText w:val=""/>
+      <w:lvlJc w:val="left"/>
+      <w:pPr>
+        <w:tabs>
+          <w:tab w:val="num" w:pos="720"/>
+        </w:tabs>
+        <w:ind w:left="720" w:hanging="360"/>
+      </w:pPr>
+      <w:rPr>
+        <w:rFonts w:ascii="Symbol" w:hAnsi="Symbol" w:hint="default"/>
+        <w:sz w:val="20"/>
+      </w:rPr>
+    </w:lvl>
+    <w:lvl w:ilvl="1" w:tentative="1">
+      <w:start w:val="1"/>
+      <w:numFmt w:val="bullet"/>
+      <w:lvlText w:val="o"/>
+      <w:lvlJc w:val="left"/>
+      <w:pPr>
+        <w:tabs>
+          <w:tab w:val="num" w:pos="1440"/>
+        </w:tabs>
+        <w:ind w:left="1440" w:hanging="360"/>
+      </w:pPr>
+      <w:rPr>
+        <w:rFonts w:ascii="Courier New" w:hAnsi="Courier New" w:hint="default"/>
+        <w:sz w:val="20"/>
+      </w:rPr>
+    </w:lvl>
+    <w:lvl w:ilvl="2" w:tentative="1">
+      <w:start w:val="1"/>
+      <w:numFmt w:val="bullet"/>
+      <w:lvlText w:val=""/>
+      <w:lvlJc w:val="left"/>
+      <w:pPr>
+        <w:tabs>
+          <w:tab w:val="num" w:pos="2160"/>
+        </w:tabs>
+        <w:ind w:left="2160" w:hanging="360"/>
+      </w:pPr>
+      <w:rPr>
+        <w:rFonts w:ascii="Wingdings" w:hAnsi="Wingdings" w:hint="default"/>
+        <w:sz w:val="20"/>
+      </w:rPr>
+    </w:lvl>
+    <w:lvl w:ilvl="3" w:tentative="1">
+      <w:start w:val="1"/>
+      <w:numFmt w:val="bullet"/>
+      <w:lvlText w:val=""/>
+      <w:lvlJc w:val="left"/>
+      <w:pPr>
+        <w:tabs>
+          <w:tab w:val="num" w:pos="2880"/>
+        </w:tabs>
+        <w:ind w:left="2880" w:hanging="360"/>
+      </w:pPr>
+      <w:rPr>
+        <w:rFonts w:ascii="Wingdings" w:hAnsi="Wingdings" w:hint="default"/>
+        <w:sz w:val="20"/>
+      </w:rPr>
+    </w:lvl>
+    <w:lvl w:ilvl="4" w:tentative="1">
+      <w:start w:val="1"/>
+      <w:numFmt w:val="bullet"/>
+      <w:lvlText w:val=""/>
+      <w:lvlJc w:val="left"/>
+      <w:pPr>
+        <w:tabs>
+          <w:tab w:val="num" w:pos="3600"/>
+        </w:tabs>
+        <w:ind w:left="3600" w:hanging="360"/>
+      </w:pPr>
+      <w:rPr>
+        <w:rFonts w:ascii="Wingdings" w:hAnsi="Wingdings" w:hint="default"/>
+        <w:sz w:val="20"/>
+      </w:rPr>
+    </w:lvl>
+    <w:lvl w:ilvl="5" w:tentative="1">
+      <w:start w:val="1"/>
+      <w:numFmt w:val="bullet"/>
+      <w:lvlText w:val=""/>
+      <w:lvlJc w:val="left"/>
+      <w:pPr>
+        <w:tabs>
+          <w:tab w:val="num" w:pos="4320"/>
+        </w:tabs>
+        <w:ind w:left="4320" w:hanging="360"/>
+      </w:pPr>
+      <w:rPr>
+        <w:rFonts w:ascii="Wingdings" w:hAnsi="Wingdings" w:hint="default"/>
+        <w:sz w:val="20"/>
+      </w:rPr>
+    </w:lvl>
+    <w:lvl w:ilvl="6" w:tentative="1">
+      <w:start w:val="1"/>
+      <w:numFmt w:val="bullet"/>
+      <w:lvlText w:val=""/>
+      <w:lvlJc w:val="left"/>
+      <w:pPr>
+        <w:tabs>
+          <w:tab w:val="num" w:pos="5040"/>
+        </w:tabs>
+        <w:ind w:left="5040" w:hanging="360"/>
+      </w:pPr>
+      <w:rPr>
+        <w:rFonts w:ascii="Wingdings" w:hAnsi="Wingdings" w:hint="default"/>
+        <w:sz w:val="20"/>
+      </w:rPr>
+    </w:lvl>
+    <w:lvl w:ilvl="7" w:tentative="1">
+      <w:start w:val="1"/>
+      <w:numFmt w:val="bullet"/>
+      <w:lvlText w:val=""/>
+      <w:lvlJc w:val="left"/>
+      <w:pPr>
+        <w:tabs>
+          <w:tab w:val="num" w:pos="5760"/>
+        </w:tabs>
+        <w:ind w:left="5760" w:hanging="360"/>
+      </w:pPr>
+      <w:rPr>
+        <w:rFonts w:ascii="Wingdings" w:hAnsi="Wingdings" w:hint="default"/>
+        <w:sz w:val="20"/>
+      </w:rPr>
+    </w:lvl>
+    <w:lvl w:ilvl="8" w:tentative="1">
+      <w:start w:val="1"/>
+      <w:numFmt w:val="bullet"/>
+      <w:lvlText w:val=""/>
+      <w:lvlJc w:val="left"/>
+      <w:pPr>
+        <w:tabs>
+          <w:tab w:val="num" w:pos="6480"/>
+        </w:tabs>
+        <w:ind w:left="6480" w:hanging="360"/>
+      </w:pPr>
+      <w:rPr>
+        <w:rFonts w:ascii="Wingdings" w:hAnsi="Wingdings" w:hint="default"/>
+        <w:sz w:val="20"/>
+      </w:rPr>
+    </w:lvl>
+  </w:abstractNum>
+  <w:abstractNum w:abstractNumId="24" w15:restartNumberingAfterBreak="0">
     <w:nsid w:val="679A33F6"/>
     <w:multiLevelType w:val="hybridMultilevel"/>
     <w:tmpl w:val="FFFFFFFF"/>
@@ -2409,29 +6069,291 @@
       </w:rPr>
     </w:lvl>
   </w:abstractNum>
+  <w:abstractNum w:abstractNumId="25" w15:restartNumberingAfterBreak="0">
+    <w:nsid w:val="71D83187"/>
+    <w:multiLevelType w:val="hybridMultilevel"/>
+    <w:tmpl w:val="A9EC35A4"/>
+    <w:lvl w:ilvl="0" w:tplc="04090001">
+      <w:start w:val="1"/>
+      <w:numFmt w:val="bullet"/>
+      <w:lvlText w:val=""/>
+      <w:lvlJc w:val="left"/>
+      <w:pPr>
+        <w:ind w:left="720" w:hanging="360"/>
+      </w:pPr>
+      <w:rPr>
+        <w:rFonts w:ascii="Symbol" w:hAnsi="Symbol" w:hint="default"/>
+      </w:rPr>
+    </w:lvl>
+    <w:lvl w:ilvl="1" w:tplc="FFFFFFFF">
+      <w:start w:val="1"/>
+      <w:numFmt w:val="bullet"/>
+      <w:lvlText w:val="o"/>
+      <w:lvlJc w:val="left"/>
+      <w:pPr>
+        <w:ind w:left="1440" w:hanging="360"/>
+      </w:pPr>
+      <w:rPr>
+        <w:rFonts w:ascii="Courier New" w:hAnsi="Courier New" w:cs="Courier New" w:hint="default"/>
+      </w:rPr>
+    </w:lvl>
+    <w:lvl w:ilvl="2" w:tplc="FFFFFFFF" w:tentative="1">
+      <w:start w:val="1"/>
+      <w:numFmt w:val="bullet"/>
+      <w:lvlText w:val=""/>
+      <w:lvlJc w:val="left"/>
+      <w:pPr>
+        <w:ind w:left="2160" w:hanging="360"/>
+      </w:pPr>
+      <w:rPr>
+        <w:rFonts w:ascii="Wingdings" w:hAnsi="Wingdings" w:hint="default"/>
+      </w:rPr>
+    </w:lvl>
+    <w:lvl w:ilvl="3" w:tplc="FFFFFFFF" w:tentative="1">
+      <w:start w:val="1"/>
+      <w:numFmt w:val="bullet"/>
+      <w:lvlText w:val=""/>
+      <w:lvlJc w:val="left"/>
+      <w:pPr>
+        <w:ind w:left="2880" w:hanging="360"/>
+      </w:pPr>
+      <w:rPr>
+        <w:rFonts w:ascii="Symbol" w:hAnsi="Symbol" w:hint="default"/>
+      </w:rPr>
+    </w:lvl>
+    <w:lvl w:ilvl="4" w:tplc="FFFFFFFF" w:tentative="1">
+      <w:start w:val="1"/>
+      <w:numFmt w:val="bullet"/>
+      <w:lvlText w:val="o"/>
+      <w:lvlJc w:val="left"/>
+      <w:pPr>
+        <w:ind w:left="3600" w:hanging="360"/>
+      </w:pPr>
+      <w:rPr>
+        <w:rFonts w:ascii="Courier New" w:hAnsi="Courier New" w:cs="Courier New" w:hint="default"/>
+      </w:rPr>
+    </w:lvl>
+    <w:lvl w:ilvl="5" w:tplc="FFFFFFFF" w:tentative="1">
+      <w:start w:val="1"/>
+      <w:numFmt w:val="bullet"/>
+      <w:lvlText w:val=""/>
+      <w:lvlJc w:val="left"/>
+      <w:pPr>
+        <w:ind w:left="4320" w:hanging="360"/>
+      </w:pPr>
+      <w:rPr>
+        <w:rFonts w:ascii="Wingdings" w:hAnsi="Wingdings" w:hint="default"/>
+      </w:rPr>
+    </w:lvl>
+    <w:lvl w:ilvl="6" w:tplc="FFFFFFFF" w:tentative="1">
+      <w:start w:val="1"/>
+      <w:numFmt w:val="bullet"/>
+      <w:lvlText w:val=""/>
+      <w:lvlJc w:val="left"/>
+      <w:pPr>
+        <w:ind w:left="5040" w:hanging="360"/>
+      </w:pPr>
+      <w:rPr>
+        <w:rFonts w:ascii="Symbol" w:hAnsi="Symbol" w:hint="default"/>
+      </w:rPr>
+    </w:lvl>
+    <w:lvl w:ilvl="7" w:tplc="FFFFFFFF" w:tentative="1">
+      <w:start w:val="1"/>
+      <w:numFmt w:val="bullet"/>
+      <w:lvlText w:val="o"/>
+      <w:lvlJc w:val="left"/>
+      <w:pPr>
+        <w:ind w:left="5760" w:hanging="360"/>
+      </w:pPr>
+      <w:rPr>
+        <w:rFonts w:ascii="Courier New" w:hAnsi="Courier New" w:cs="Courier New" w:hint="default"/>
+      </w:rPr>
+    </w:lvl>
+    <w:lvl w:ilvl="8" w:tplc="FFFFFFFF" w:tentative="1">
+      <w:start w:val="1"/>
+      <w:numFmt w:val="bullet"/>
+      <w:lvlText w:val=""/>
+      <w:lvlJc w:val="left"/>
+      <w:pPr>
+        <w:ind w:left="6480" w:hanging="360"/>
+      </w:pPr>
+      <w:rPr>
+        <w:rFonts w:ascii="Wingdings" w:hAnsi="Wingdings" w:hint="default"/>
+      </w:rPr>
+    </w:lvl>
+  </w:abstractNum>
+  <w:abstractNum w:abstractNumId="26" w15:restartNumberingAfterBreak="0">
+    <w:nsid w:val="79870E5D"/>
+    <w:multiLevelType w:val="multilevel"/>
+    <w:tmpl w:val="8E1C509E"/>
+    <w:lvl w:ilvl="0">
+      <w:start w:val="1"/>
+      <w:numFmt w:val="bullet"/>
+      <w:lvlText w:val=""/>
+      <w:lvlJc w:val="left"/>
+      <w:pPr>
+        <w:tabs>
+          <w:tab w:val="num" w:pos="720"/>
+        </w:tabs>
+        <w:ind w:left="720" w:hanging="360"/>
+      </w:pPr>
+      <w:rPr>
+        <w:rFonts w:ascii="Symbol" w:hAnsi="Symbol" w:hint="default"/>
+        <w:sz w:val="20"/>
+      </w:rPr>
+    </w:lvl>
+    <w:lvl w:ilvl="1" w:tentative="1">
+      <w:start w:val="1"/>
+      <w:numFmt w:val="bullet"/>
+      <w:lvlText w:val="o"/>
+      <w:lvlJc w:val="left"/>
+      <w:pPr>
+        <w:tabs>
+          <w:tab w:val="num" w:pos="1440"/>
+        </w:tabs>
+        <w:ind w:left="1440" w:hanging="360"/>
+      </w:pPr>
+      <w:rPr>
+        <w:rFonts w:ascii="Courier New" w:hAnsi="Courier New" w:hint="default"/>
+        <w:sz w:val="20"/>
+      </w:rPr>
+    </w:lvl>
+    <w:lvl w:ilvl="2" w:tentative="1">
+      <w:start w:val="1"/>
+      <w:numFmt w:val="bullet"/>
+      <w:lvlText w:val=""/>
+      <w:lvlJc w:val="left"/>
+      <w:pPr>
+        <w:tabs>
+          <w:tab w:val="num" w:pos="2160"/>
+        </w:tabs>
+        <w:ind w:left="2160" w:hanging="360"/>
+      </w:pPr>
+      <w:rPr>
+        <w:rFonts w:ascii="Wingdings" w:hAnsi="Wingdings" w:hint="default"/>
+        <w:sz w:val="20"/>
+      </w:rPr>
+    </w:lvl>
+    <w:lvl w:ilvl="3" w:tentative="1">
+      <w:start w:val="1"/>
+      <w:numFmt w:val="bullet"/>
+      <w:lvlText w:val=""/>
+      <w:lvlJc w:val="left"/>
+      <w:pPr>
+        <w:tabs>
+          <w:tab w:val="num" w:pos="2880"/>
+        </w:tabs>
+        <w:ind w:left="2880" w:hanging="360"/>
+      </w:pPr>
+      <w:rPr>
+        <w:rFonts w:ascii="Wingdings" w:hAnsi="Wingdings" w:hint="default"/>
+        <w:sz w:val="20"/>
+      </w:rPr>
+    </w:lvl>
+    <w:lvl w:ilvl="4" w:tentative="1">
+      <w:start w:val="1"/>
+      <w:numFmt w:val="bullet"/>
+      <w:lvlText w:val=""/>
+      <w:lvlJc w:val="left"/>
+      <w:pPr>
+        <w:tabs>
+          <w:tab w:val="num" w:pos="3600"/>
+        </w:tabs>
+        <w:ind w:left="3600" w:hanging="360"/>
+      </w:pPr>
+      <w:rPr>
+        <w:rFonts w:ascii="Wingdings" w:hAnsi="Wingdings" w:hint="default"/>
+        <w:sz w:val="20"/>
+      </w:rPr>
+    </w:lvl>
+    <w:lvl w:ilvl="5" w:tentative="1">
+      <w:start w:val="1"/>
+      <w:numFmt w:val="bullet"/>
+      <w:lvlText w:val=""/>
+      <w:lvlJc w:val="left"/>
+      <w:pPr>
+        <w:tabs>
+          <w:tab w:val="num" w:pos="4320"/>
+        </w:tabs>
+        <w:ind w:left="4320" w:hanging="360"/>
+      </w:pPr>
+      <w:rPr>
+        <w:rFonts w:ascii="Wingdings" w:hAnsi="Wingdings" w:hint="default"/>
+        <w:sz w:val="20"/>
+      </w:rPr>
+    </w:lvl>
+    <w:lvl w:ilvl="6" w:tentative="1">
+      <w:start w:val="1"/>
+      <w:numFmt w:val="bullet"/>
+      <w:lvlText w:val=""/>
+      <w:lvlJc w:val="left"/>
+      <w:pPr>
+        <w:tabs>
+          <w:tab w:val="num" w:pos="5040"/>
+        </w:tabs>
+        <w:ind w:left="5040" w:hanging="360"/>
+      </w:pPr>
+      <w:rPr>
+        <w:rFonts w:ascii="Wingdings" w:hAnsi="Wingdings" w:hint="default"/>
+        <w:sz w:val="20"/>
+      </w:rPr>
+    </w:lvl>
+    <w:lvl w:ilvl="7" w:tentative="1">
+      <w:start w:val="1"/>
+      <w:numFmt w:val="bullet"/>
+      <w:lvlText w:val=""/>
+      <w:lvlJc w:val="left"/>
+      <w:pPr>
+        <w:tabs>
+          <w:tab w:val="num" w:pos="5760"/>
+        </w:tabs>
+        <w:ind w:left="5760" w:hanging="360"/>
+      </w:pPr>
+      <w:rPr>
+        <w:rFonts w:ascii="Wingdings" w:hAnsi="Wingdings" w:hint="default"/>
+        <w:sz w:val="20"/>
+      </w:rPr>
+    </w:lvl>
+    <w:lvl w:ilvl="8" w:tentative="1">
+      <w:start w:val="1"/>
+      <w:numFmt w:val="bullet"/>
+      <w:lvlText w:val=""/>
+      <w:lvlJc w:val="left"/>
+      <w:pPr>
+        <w:tabs>
+          <w:tab w:val="num" w:pos="6480"/>
+        </w:tabs>
+        <w:ind w:left="6480" w:hanging="360"/>
+      </w:pPr>
+      <w:rPr>
+        <w:rFonts w:ascii="Wingdings" w:hAnsi="Wingdings" w:hint="default"/>
+        <w:sz w:val="20"/>
+      </w:rPr>
+    </w:lvl>
+  </w:abstractNum>
   <w:num w:numId="1" w16cid:durableId="370500936">
+    <w:abstractNumId w:val="18"/>
+  </w:num>
+  <w:num w:numId="2" w16cid:durableId="14423233">
     <w:abstractNumId w:val="14"/>
   </w:num>
-  <w:num w:numId="2" w16cid:durableId="14423233">
+  <w:num w:numId="3" w16cid:durableId="433552640">
+    <w:abstractNumId w:val="22"/>
+  </w:num>
+  <w:num w:numId="4" w16cid:durableId="2100833960">
+    <w:abstractNumId w:val="24"/>
+  </w:num>
+  <w:num w:numId="5" w16cid:durableId="1928073602">
+    <w:abstractNumId w:val="12"/>
+  </w:num>
+  <w:num w:numId="6" w16cid:durableId="1738355898">
     <w:abstractNumId w:val="11"/>
   </w:num>
-  <w:num w:numId="3" w16cid:durableId="433552640">
-    <w:abstractNumId w:val="15"/>
-  </w:num>
-  <w:num w:numId="4" w16cid:durableId="2100833960">
+  <w:num w:numId="7" w16cid:durableId="1374040589">
     <w:abstractNumId w:val="16"/>
   </w:num>
-  <w:num w:numId="5" w16cid:durableId="1928073602">
-    <w:abstractNumId w:val="10"/>
-  </w:num>
-  <w:num w:numId="6" w16cid:durableId="1738355898">
-    <w:abstractNumId w:val="9"/>
-  </w:num>
-  <w:num w:numId="7" w16cid:durableId="1374040589">
-    <w:abstractNumId w:val="12"/>
-  </w:num>
   <w:num w:numId="8" w16cid:durableId="574826988">
-    <w:abstractNumId w:val="13"/>
+    <w:abstractNumId w:val="17"/>
   </w:num>
   <w:num w:numId="9" w16cid:durableId="1931431241">
     <w:abstractNumId w:val="8"/>
@@ -2459,6 +6381,36 @@
   </w:num>
   <w:num w:numId="17" w16cid:durableId="1288319745">
     <w:abstractNumId w:val="0"/>
+  </w:num>
+  <w:num w:numId="18" w16cid:durableId="1753743555">
+    <w:abstractNumId w:val="13"/>
+  </w:num>
+  <w:num w:numId="19" w16cid:durableId="134759311">
+    <w:abstractNumId w:val="26"/>
+  </w:num>
+  <w:num w:numId="20" w16cid:durableId="1269435801">
+    <w:abstractNumId w:val="9"/>
+  </w:num>
+  <w:num w:numId="21" w16cid:durableId="688722895">
+    <w:abstractNumId w:val="23"/>
+  </w:num>
+  <w:num w:numId="22" w16cid:durableId="2117943402">
+    <w:abstractNumId w:val="10"/>
+  </w:num>
+  <w:num w:numId="23" w16cid:durableId="494614280">
+    <w:abstractNumId w:val="20"/>
+  </w:num>
+  <w:num w:numId="24" w16cid:durableId="180896640">
+    <w:abstractNumId w:val="19"/>
+  </w:num>
+  <w:num w:numId="25" w16cid:durableId="902177390">
+    <w:abstractNumId w:val="25"/>
+  </w:num>
+  <w:num w:numId="26" w16cid:durableId="883953538">
+    <w:abstractNumId w:val="21"/>
+  </w:num>
+  <w:num w:numId="27" w16cid:durableId="349137809">
+    <w:abstractNumId w:val="15"/>
   </w:num>
 </w:numbering>
 </file>
@@ -3066,7 +7018,6 @@
   <w:style w:type="character" w:default="1" w:styleId="DefaultParagraphFont">
     <w:name w:val="Default Paragraph Font"/>
     <w:uiPriority w:val="1"/>
-    <w:semiHidden/>
     <w:unhideWhenUsed/>
   </w:style>
   <w:style w:type="table" w:default="1" w:styleId="TableNormal">
@@ -13843,6 +17794,108 @@
       </w:tcPr>
     </w:tblStylePr>
   </w:style>
+  <w:style w:type="paragraph" w:styleId="FootnoteText">
+    <w:name w:val="footnote text"/>
+    <w:basedOn w:val="Normal"/>
+    <w:link w:val="FootnoteTextChar"/>
+    <w:uiPriority w:val="99"/>
+    <w:semiHidden/>
+    <w:unhideWhenUsed/>
+    <w:rsid w:val="009138C8"/>
+    <w:pPr>
+      <w:spacing w:after="0" w:line="240" w:lineRule="auto"/>
+    </w:pPr>
+    <w:rPr>
+      <w:sz w:val="20"/>
+      <w:szCs w:val="20"/>
+    </w:rPr>
+  </w:style>
+  <w:style w:type="character" w:customStyle="1" w:styleId="FootnoteTextChar">
+    <w:name w:val="Footnote Text Char"/>
+    <w:basedOn w:val="DefaultParagraphFont"/>
+    <w:link w:val="FootnoteText"/>
+    <w:uiPriority w:val="99"/>
+    <w:semiHidden/>
+    <w:rsid w:val="009138C8"/>
+    <w:rPr>
+      <w:sz w:val="20"/>
+      <w:szCs w:val="20"/>
+    </w:rPr>
+  </w:style>
+  <w:style w:type="character" w:styleId="FootnoteReference">
+    <w:name w:val="footnote reference"/>
+    <w:basedOn w:val="DefaultParagraphFont"/>
+    <w:uiPriority w:val="99"/>
+    <w:semiHidden/>
+    <w:unhideWhenUsed/>
+    <w:rsid w:val="009138C8"/>
+    <w:rPr>
+      <w:vertAlign w:val="superscript"/>
+    </w:rPr>
+  </w:style>
+  <w:style w:type="table" w:styleId="PlainTable1">
+    <w:name w:val="Plain Table 1"/>
+    <w:basedOn w:val="TableNormal"/>
+    <w:uiPriority w:val="99"/>
+    <w:rsid w:val="00EF4308"/>
+    <w:pPr>
+      <w:spacing w:after="0" w:line="240" w:lineRule="auto"/>
+    </w:pPr>
+    <w:tblPr>
+      <w:tblStyleRowBandSize w:val="1"/>
+      <w:tblStyleColBandSize w:val="1"/>
+      <w:tblBorders>
+        <w:top w:val="single" w:sz="4" w:space="0" w:color="BFBFBF" w:themeColor="background1" w:themeShade="BF"/>
+        <w:left w:val="single" w:sz="4" w:space="0" w:color="BFBFBF" w:themeColor="background1" w:themeShade="BF"/>
+        <w:bottom w:val="single" w:sz="4" w:space="0" w:color="BFBFBF" w:themeColor="background1" w:themeShade="BF"/>
+        <w:right w:val="single" w:sz="4" w:space="0" w:color="BFBFBF" w:themeColor="background1" w:themeShade="BF"/>
+        <w:insideH w:val="single" w:sz="4" w:space="0" w:color="BFBFBF" w:themeColor="background1" w:themeShade="BF"/>
+        <w:insideV w:val="single" w:sz="4" w:space="0" w:color="BFBFBF" w:themeColor="background1" w:themeShade="BF"/>
+      </w:tblBorders>
+    </w:tblPr>
+    <w:tblStylePr w:type="firstRow">
+      <w:rPr>
+        <w:b/>
+        <w:bCs/>
+      </w:rPr>
+    </w:tblStylePr>
+    <w:tblStylePr w:type="lastRow">
+      <w:rPr>
+        <w:b/>
+        <w:bCs/>
+      </w:rPr>
+      <w:tblPr/>
+      <w:tcPr>
+        <w:tcBorders>
+          <w:top w:val="double" w:sz="4" w:space="0" w:color="BFBFBF" w:themeColor="background1" w:themeShade="BF"/>
+        </w:tcBorders>
+      </w:tcPr>
+    </w:tblStylePr>
+    <w:tblStylePr w:type="firstCol">
+      <w:rPr>
+        <w:b/>
+        <w:bCs/>
+      </w:rPr>
+    </w:tblStylePr>
+    <w:tblStylePr w:type="lastCol">
+      <w:rPr>
+        <w:b/>
+        <w:bCs/>
+      </w:rPr>
+    </w:tblStylePr>
+    <w:tblStylePr w:type="band1Vert">
+      <w:tblPr/>
+      <w:tcPr>
+        <w:shd w:val="clear" w:color="auto" w:fill="F2F2F2" w:themeFill="background1" w:themeFillShade="F2"/>
+      </w:tcPr>
+    </w:tblStylePr>
+    <w:tblStylePr w:type="band1Horz">
+      <w:tblPr/>
+      <w:tcPr>
+        <w:shd w:val="clear" w:color="auto" w:fill="F2F2F2" w:themeFill="background1" w:themeFillShade="F2"/>
+      </w:tcPr>
+    </w:tblStylePr>
+  </w:style>
 </w:styles>
 </file>
 

</xml_diff>